<commit_message>
Day25-LongTermMemory: guard corrupted memory file, fix stale header comment, add project.md
LoadMemory deserialized user_memory.json with no null-fallback or
exception handling - an empty/truncated/corrupted file (e.g. left by
a prior crash) would either NRE or throw, permanently blocking every
future run of a lesson whose whole point is durability across
restarts. Falls back to a fresh UserMemory with a warning. Also fixes
Program.cs's header comment, which called the fully-wired entry point
"still a placeholder." Syncs the docx's Complete Code listing and
replaces missing.md with project.md.
</commit_message>
<xml_diff>
--- a/Day25-LongTermMemroy.docx
+++ b/Day25-LongTermMemroy.docx
@@ -105,11 +105,7 @@
         <w:ind w:left="1080"/>
       </w:pPr>
       <w:r>
-        <w:t>Note: The key is read from the `GEMINI_API_KEY` environment variable; the app throws immediately at startup if it isn't set. The memory file itself</w:t>
-      </w:r>
-      <w:r>
-        <w:lastRenderedPageBreak/>
-        <w:t xml:space="preserve"> defaults to `user_memory.json` in the working directory and is created automatically the first time a fact is saved.</w:t>
+        <w:t>Note: The key is read from the `GEMINI_API_KEY` environment variable; the app throws immediately at startup if it isn't set. The memory file itself defaults to `user_memory.json` in the working directory and is created automatically the first time a fact is saved.</w:t>
       </w:r>
     </w:p>
     <w:p/>
@@ -137,7 +133,11 @@
         <w:t>State Persistence via File I/O</w:t>
       </w:r>
       <w:r>
-        <w:t>: `MemoryManager` uses `System.Text.Json` to serialize a `UserMemory` object (a flat `List&lt;string&gt;` of facts) to `user_memory.json`, and deserializes it back on the next run — a minimal, dependency-free substitute for a real memory store.</w:t>
+        <w:t xml:space="preserve">: `MemoryManager` uses `System.Text.Json` to serialize a `UserMemory` object (a flat `List&lt;string&gt;` of facts) to </w:t>
+      </w:r>
+      <w:r>
+        <w:lastRenderedPageBreak/>
+        <w:t>`user_memory.json`, and deserializes it back on the next run — a minimal, dependency-free substitute for a real memory store.</w:t>
       </w:r>
     </w:p>
     <w:p>
@@ -156,11 +156,7 @@
         <w:t>Background Fact Extraction</w:t>
       </w:r>
       <w:r>
-        <w:t>: The LLM is reused as a data-processing tool, not just a conversationalist. `ExtractAndSaveFactAsync` sends a strict, separate prompt that asks the model to output either a shor</w:t>
-      </w:r>
-      <w:r>
-        <w:lastRenderedPageBreak/>
-        <w:t>t factual sentence or the literal string `"NONE"`, which the code then checks for.</w:t>
+        <w:t>: The LLM is reused as a data-processing tool, not just a conversationalist. `ExtractAndSaveFactAsync` sends a strict, separate prompt that asks the model to output either a short factual sentence or the literal string `"NONE"`, which the code then checks for.</w:t>
       </w:r>
     </w:p>
     <w:p>
@@ -217,11 +213,7 @@
         <w:t>Manual ChatHistory Splicing</w:t>
       </w:r>
       <w:r>
-        <w:t>: To keep the persona/memory system message from permanently polluting the conversation, `MemoryAgent` inserts the system message at index 0 immediately before calling the model, then removes it (`RemoveAt(0)`) immedi</w:t>
-      </w:r>
-      <w:r>
-        <w:lastRenderedPageBreak/>
-        <w:t>ately after — a hand-rolled technique for injecting transient context into an otherwise stable history.</w:t>
+        <w:t>: To keep the persona/memory system message from permanently polluting the conversation, `MemoryAgent` inserts the system message at index 0 immediately before calling the model, then removes it (`RemoveAt(0)`) immediately after — a hand-rolled technique for injecting transient context into an otherwise stable history.</w:t>
       </w:r>
     </w:p>
     <w:p>
@@ -326,71 +318,87 @@
           <w:rFonts w:ascii="Consolas" w:hAnsi="Consolas"/>
           <w:sz w:val="19"/>
         </w:rPr>
-        <w:t>// Intended to give an agent persistent, cross-session memory of facts about</w:t>
-      </w:r>
-    </w:p>
-    <w:p>
-      <w:pPr>
-        <w:pStyle w:val="NoSpacing"/>
-        <w:rPr>
-          <w:rFonts w:ascii="Consolas" w:hAnsi="Consolas"/>
-          <w:sz w:val="19"/>
-        </w:rPr>
-      </w:pPr>
-      <w:r>
-        <w:rPr>
-          <w:rFonts w:ascii="Consolas" w:hAnsi="Consolas"/>
-          <w:sz w:val="19"/>
-        </w:rPr>
-        <w:t>// the user (see MemoryManager.cs/UserMemory.cs: facts are extracted from</w:t>
-      </w:r>
-    </w:p>
-    <w:p>
-      <w:pPr>
-        <w:pStyle w:val="NoSpacing"/>
-        <w:rPr>
-          <w:rFonts w:ascii="Consolas" w:hAnsi="Consolas"/>
-          <w:sz w:val="19"/>
-        </w:rPr>
-      </w:pPr>
-      <w:r>
-        <w:rPr>
-          <w:rFonts w:ascii="Consolas" w:hAnsi="Consolas"/>
-          <w:sz w:val="19"/>
-        </w:rPr>
-        <w:t>// conversation and saved to user_memory.json so they survive a restart).</w:t>
-      </w:r>
-    </w:p>
-    <w:p>
-      <w:pPr>
-        <w:pStyle w:val="NoSpacing"/>
-        <w:rPr>
-          <w:rFonts w:ascii="Consolas" w:hAnsi="Consolas"/>
-          <w:sz w:val="19"/>
-        </w:rPr>
-      </w:pPr>
-      <w:r>
-        <w:rPr>
-          <w:rFonts w:ascii="Consolas" w:hAnsi="Consolas"/>
-          <w:sz w:val="19"/>
-        </w:rPr>
-        <w:t>// This entry point is still a placeholder - it doesn't yet wire up a Kernel,</w:t>
-      </w:r>
-    </w:p>
-    <w:p>
-      <w:pPr>
-        <w:pStyle w:val="NoSpacing"/>
-        <w:rPr>
-          <w:rFonts w:ascii="Consolas" w:hAnsi="Consolas"/>
-          <w:sz w:val="19"/>
-        </w:rPr>
-      </w:pPr>
-      <w:r>
-        <w:rPr>
-          <w:rFonts w:ascii="Consolas" w:hAnsi="Consolas"/>
-          <w:sz w:val="19"/>
-        </w:rPr>
-        <w:t>// chat loop, or MemoryManager instance.</w:t>
+        <w:t>// Gives an agent persistent, cross-session memory of facts about the user</w:t>
+      </w:r>
+    </w:p>
+    <w:p>
+      <w:pPr>
+        <w:pStyle w:val="NoSpacing"/>
+        <w:rPr>
+          <w:rFonts w:ascii="Consolas" w:hAnsi="Consolas"/>
+          <w:sz w:val="19"/>
+        </w:rPr>
+      </w:pPr>
+      <w:r>
+        <w:rPr>
+          <w:rFonts w:ascii="Consolas" w:hAnsi="Consolas"/>
+          <w:sz w:val="19"/>
+        </w:rPr>
+        <w:t>// (see MemoryManager.cs/UserMemory.cs: facts are extracted from conversation</w:t>
+      </w:r>
+    </w:p>
+    <w:p>
+      <w:pPr>
+        <w:pStyle w:val="NoSpacing"/>
+        <w:rPr>
+          <w:rFonts w:ascii="Consolas" w:hAnsi="Consolas"/>
+          <w:sz w:val="19"/>
+        </w:rPr>
+      </w:pPr>
+      <w:r>
+        <w:rPr>
+          <w:rFonts w:ascii="Consolas" w:hAnsi="Consolas"/>
+          <w:sz w:val="19"/>
+        </w:rPr>
+        <w:t>// and saved to user_memory.json so they survive a restart). This entry point</w:t>
+      </w:r>
+    </w:p>
+    <w:p>
+      <w:pPr>
+        <w:pStyle w:val="NoSpacing"/>
+        <w:rPr>
+          <w:rFonts w:ascii="Consolas" w:hAnsi="Consolas"/>
+          <w:sz w:val="19"/>
+        </w:rPr>
+      </w:pPr>
+      <w:r>
+        <w:rPr>
+          <w:rFonts w:ascii="Consolas" w:hAnsi="Consolas"/>
+          <w:sz w:val="19"/>
+        </w:rPr>
+        <w:t>// wires up the Kernel, the MemoryManager (fact extraction/persistence), and</w:t>
+      </w:r>
+    </w:p>
+    <w:p>
+      <w:pPr>
+        <w:pStyle w:val="NoSpacing"/>
+        <w:rPr>
+          <w:rFonts w:ascii="Consolas" w:hAnsi="Consolas"/>
+          <w:sz w:val="19"/>
+        </w:rPr>
+      </w:pPr>
+      <w:r>
+        <w:rPr>
+          <w:rFonts w:ascii="Consolas" w:hAnsi="Consolas"/>
+          <w:sz w:val="19"/>
+        </w:rPr>
+        <w:t>// the MemoryAgent (chat), then runs the conversational loop that ties them</w:t>
+      </w:r>
+    </w:p>
+    <w:p>
+      <w:pPr>
+        <w:pStyle w:val="NoSpacing"/>
+        <w:rPr>
+          <w:rFonts w:ascii="Consolas" w:hAnsi="Consolas"/>
+          <w:sz w:val="19"/>
+        </w:rPr>
+      </w:pPr>
+      <w:r>
+        <w:rPr>
+          <w:rFonts w:ascii="Consolas" w:hAnsi="Consolas"/>
+          <w:sz w:val="19"/>
+        </w:rPr>
+        <w:t>// together.</w:t>
       </w:r>
     </w:p>
     <w:p>
@@ -497,6 +505,7 @@
           <w:rFonts w:ascii="Consolas" w:hAnsi="Consolas"/>
           <w:sz w:val="19"/>
         </w:rPr>
+        <w:lastRenderedPageBreak/>
         <w:t>{</w:t>
       </w:r>
     </w:p>
@@ -577,292 +586,1962 @@
           <w:rFonts w:ascii="Consolas" w:hAnsi="Consolas"/>
           <w:sz w:val="19"/>
         </w:rPr>
-        <w:t xml:space="preserve">   </w:t>
-      </w:r>
+        <w:t xml:space="preserve">            // 1. Initialize the Kernel</w:t>
+      </w:r>
+    </w:p>
+    <w:p>
+      <w:pPr>
+        <w:pStyle w:val="NoSpacing"/>
+        <w:rPr>
+          <w:rFonts w:ascii="Consolas" w:hAnsi="Consolas"/>
+          <w:sz w:val="19"/>
+        </w:rPr>
+      </w:pPr>
+      <w:r>
+        <w:rPr>
+          <w:rFonts w:ascii="Consolas" w:hAnsi="Consolas"/>
+          <w:sz w:val="19"/>
+        </w:rPr>
+        <w:t xml:space="preserve">            IKernelBuilder builder = Kernel.CreateBuilder();</w:t>
+      </w:r>
+    </w:p>
+    <w:p>
+      <w:pPr>
+        <w:pStyle w:val="NoSpacing"/>
+        <w:rPr>
+          <w:rFonts w:ascii="Consolas" w:hAnsi="Consolas"/>
+          <w:sz w:val="19"/>
+        </w:rPr>
+      </w:pPr>
+      <w:r>
+        <w:rPr>
+          <w:rFonts w:ascii="Consolas" w:hAnsi="Consolas"/>
+          <w:sz w:val="19"/>
+        </w:rPr>
+        <w:t xml:space="preserve">            string apiKey = Environment.GetEnvironmentVariable("GEMINI_API_KEY")</w:t>
+      </w:r>
+    </w:p>
+    <w:p>
+      <w:pPr>
+        <w:pStyle w:val="NoSpacing"/>
+        <w:rPr>
+          <w:rFonts w:ascii="Consolas" w:hAnsi="Consolas"/>
+          <w:sz w:val="19"/>
+        </w:rPr>
+      </w:pPr>
+      <w:r>
+        <w:rPr>
+          <w:rFonts w:ascii="Consolas" w:hAnsi="Consolas"/>
+          <w:sz w:val="19"/>
+        </w:rPr>
+        <w:t xml:space="preserve">                ?? throw new Exception("GEMINI_API_KEY is missing");</w:t>
+      </w:r>
+    </w:p>
+    <w:p>
+      <w:pPr>
+        <w:pStyle w:val="NoSpacing"/>
+        <w:rPr>
+          <w:rFonts w:ascii="Consolas" w:hAnsi="Consolas"/>
+          <w:sz w:val="19"/>
+        </w:rPr>
+      </w:pPr>
+    </w:p>
+    <w:p>
+      <w:pPr>
+        <w:pStyle w:val="NoSpacing"/>
+        <w:rPr>
+          <w:rFonts w:ascii="Consolas" w:hAnsi="Consolas"/>
+          <w:sz w:val="19"/>
+        </w:rPr>
+      </w:pPr>
+      <w:r>
+        <w:rPr>
+          <w:rFonts w:ascii="Consolas" w:hAnsi="Consolas"/>
+          <w:sz w:val="19"/>
+        </w:rPr>
+        <w:t xml:space="preserve">            builder.AddGoogleAIGeminiChatCompletion("gemini-2.5-flash", apiKey);</w:t>
+      </w:r>
+    </w:p>
+    <w:p>
+      <w:pPr>
+        <w:pStyle w:val="NoSpacing"/>
+        <w:rPr>
+          <w:rFonts w:ascii="Consolas" w:hAnsi="Consolas"/>
+          <w:sz w:val="19"/>
+        </w:rPr>
+      </w:pPr>
+      <w:r>
+        <w:rPr>
+          <w:rFonts w:ascii="Consolas" w:hAnsi="Consolas"/>
+          <w:sz w:val="19"/>
+        </w:rPr>
+        <w:t xml:space="preserve">            Kernel kernel = builder.Build();</w:t>
+      </w:r>
+    </w:p>
+    <w:p>
+      <w:pPr>
+        <w:pStyle w:val="NoSpacing"/>
+        <w:rPr>
+          <w:rFonts w:ascii="Consolas" w:hAnsi="Consolas"/>
+          <w:sz w:val="19"/>
+        </w:rPr>
+      </w:pPr>
+    </w:p>
+    <w:p>
+      <w:pPr>
+        <w:pStyle w:val="NoSpacing"/>
+        <w:rPr>
+          <w:rFonts w:ascii="Consolas" w:hAnsi="Consolas"/>
+          <w:sz w:val="19"/>
+        </w:rPr>
+      </w:pPr>
+      <w:r>
+        <w:rPr>
+          <w:rFonts w:ascii="Consolas" w:hAnsi="Consolas"/>
+          <w:sz w:val="19"/>
+        </w:rPr>
+        <w:t xml:space="preserve">            var chatService = kernel.GetRequiredService&lt;IChatCompletionService&gt;();</w:t>
+      </w:r>
+    </w:p>
+    <w:p>
+      <w:pPr>
+        <w:pStyle w:val="NoSpacing"/>
+        <w:rPr>
+          <w:rFonts w:ascii="Consolas" w:hAnsi="Consolas"/>
+          <w:sz w:val="19"/>
+        </w:rPr>
+      </w:pPr>
+    </w:p>
+    <w:p>
+      <w:pPr>
+        <w:pStyle w:val="NoSpacing"/>
+        <w:rPr>
+          <w:rFonts w:ascii="Consolas" w:hAnsi="Consolas"/>
+          <w:sz w:val="19"/>
+        </w:rPr>
+      </w:pPr>
+      <w:r>
+        <w:rPr>
+          <w:rFonts w:ascii="Consolas" w:hAnsi="Consolas"/>
+          <w:sz w:val="19"/>
+        </w:rPr>
+        <w:t xml:space="preserve">            // 2. Initialize Components</w:t>
+      </w:r>
+    </w:p>
+    <w:p>
+      <w:pPr>
+        <w:pStyle w:val="NoSpacing"/>
+        <w:rPr>
+          <w:rFonts w:ascii="Consolas" w:hAnsi="Consolas"/>
+          <w:sz w:val="19"/>
+        </w:rPr>
+      </w:pPr>
+      <w:r>
+        <w:rPr>
+          <w:rFonts w:ascii="Consolas" w:hAnsi="Consolas"/>
+          <w:sz w:val="19"/>
+        </w:rPr>
+        <w:t xml:space="preserve">            var memoryManager = new MemoryManager(chatService);</w:t>
+      </w:r>
+    </w:p>
+    <w:p>
+      <w:pPr>
+        <w:pStyle w:val="NoSpacing"/>
+        <w:rPr>
+          <w:rFonts w:ascii="Consolas" w:hAnsi="Consolas"/>
+          <w:sz w:val="19"/>
+        </w:rPr>
+      </w:pPr>
+      <w:r>
+        <w:rPr>
+          <w:rFonts w:ascii="Consolas" w:hAnsi="Consolas"/>
+          <w:sz w:val="19"/>
+        </w:rPr>
+        <w:t xml:space="preserve">            var memoryAgent = new MemoryAgent(chatService);</w:t>
+      </w:r>
+    </w:p>
+    <w:p>
+      <w:pPr>
+        <w:pStyle w:val="NoSpacing"/>
+        <w:rPr>
+          <w:rFonts w:ascii="Consolas" w:hAnsi="Consolas"/>
+          <w:sz w:val="19"/>
+        </w:rPr>
+      </w:pPr>
+    </w:p>
+    <w:p>
+      <w:pPr>
+        <w:pStyle w:val="NoSpacing"/>
+        <w:rPr>
+          <w:rFonts w:ascii="Consolas" w:hAnsi="Consolas"/>
+          <w:sz w:val="19"/>
+        </w:rPr>
+      </w:pPr>
+      <w:r>
+        <w:rPr>
+          <w:rFonts w:ascii="Consolas" w:hAnsi="Consolas"/>
+          <w:sz w:val="19"/>
+        </w:rPr>
+        <w:t xml:space="preserve">            Console.WriteLine("Long-Term memory agent online");</w:t>
+      </w:r>
+    </w:p>
+    <w:p>
+      <w:pPr>
+        <w:pStyle w:val="NoSpacing"/>
+        <w:rPr>
+          <w:rFonts w:ascii="Consolas" w:hAnsi="Consolas"/>
+          <w:sz w:val="19"/>
+        </w:rPr>
+      </w:pPr>
+      <w:r>
+        <w:rPr>
+          <w:rFonts w:ascii="Consolas" w:hAnsi="Consolas"/>
+          <w:sz w:val="19"/>
+        </w:rPr>
+        <w:t xml:space="preserve">            Console.WriteLine($"Loaded {memoryManager.CurrentMemory.Facts.Count} existing facts.");</w:t>
+      </w:r>
+    </w:p>
+    <w:p>
+      <w:pPr>
+        <w:pStyle w:val="NoSpacing"/>
+        <w:rPr>
+          <w:rFonts w:ascii="Consolas" w:hAnsi="Consolas"/>
+          <w:sz w:val="19"/>
+        </w:rPr>
+      </w:pPr>
+      <w:r>
+        <w:rPr>
+          <w:rFonts w:ascii="Consolas" w:hAnsi="Consolas"/>
+          <w:sz w:val="19"/>
+        </w:rPr>
+        <w:t xml:space="preserve">            Console.WriteLine("(Type 'exit' to quit)\n");</w:t>
+      </w:r>
+    </w:p>
+    <w:p>
+      <w:pPr>
+        <w:pStyle w:val="NoSpacing"/>
+        <w:rPr>
+          <w:rFonts w:ascii="Consolas" w:hAnsi="Consolas"/>
+          <w:sz w:val="19"/>
+        </w:rPr>
+      </w:pPr>
+    </w:p>
+    <w:p>
+      <w:pPr>
+        <w:pStyle w:val="NoSpacing"/>
+        <w:rPr>
+          <w:rFonts w:ascii="Consolas" w:hAnsi="Consolas"/>
+          <w:sz w:val="19"/>
+        </w:rPr>
+      </w:pPr>
+      <w:r>
+        <w:rPr>
+          <w:rFonts w:ascii="Consolas" w:hAnsi="Consolas"/>
+          <w:sz w:val="19"/>
+        </w:rPr>
+        <w:t xml:space="preserve">            // 3. The Conversational Loop</w:t>
+      </w:r>
+    </w:p>
+    <w:p>
+      <w:pPr>
+        <w:pStyle w:val="NoSpacing"/>
+        <w:rPr>
+          <w:rFonts w:ascii="Consolas" w:hAnsi="Consolas"/>
+          <w:sz w:val="19"/>
+        </w:rPr>
+      </w:pPr>
+      <w:r>
+        <w:rPr>
+          <w:rFonts w:ascii="Consolas" w:hAnsi="Consolas"/>
+          <w:sz w:val="19"/>
+        </w:rPr>
+        <w:t xml:space="preserve">            while(true)</w:t>
+      </w:r>
+    </w:p>
+    <w:p>
+      <w:pPr>
+        <w:pStyle w:val="NoSpacing"/>
+        <w:rPr>
+          <w:rFonts w:ascii="Consolas" w:hAnsi="Consolas"/>
+          <w:sz w:val="19"/>
+        </w:rPr>
+      </w:pPr>
+      <w:r>
+        <w:rPr>
+          <w:rFonts w:ascii="Consolas" w:hAnsi="Consolas"/>
+          <w:sz w:val="19"/>
+        </w:rPr>
+        <w:t xml:space="preserve">            {</w:t>
+      </w:r>
+    </w:p>
+    <w:p>
+      <w:pPr>
+        <w:pStyle w:val="NoSpacing"/>
+        <w:rPr>
+          <w:rFonts w:ascii="Consolas" w:hAnsi="Consolas"/>
+          <w:sz w:val="19"/>
+        </w:rPr>
+      </w:pPr>
+      <w:r>
+        <w:rPr>
+          <w:rFonts w:ascii="Consolas" w:hAnsi="Consolas"/>
+          <w:sz w:val="19"/>
+        </w:rPr>
+        <w:t xml:space="preserve">                Console.Write("User: ");</w:t>
+      </w:r>
+    </w:p>
+    <w:p>
+      <w:pPr>
+        <w:pStyle w:val="NoSpacing"/>
+        <w:rPr>
+          <w:rFonts w:ascii="Consolas" w:hAnsi="Consolas"/>
+          <w:sz w:val="19"/>
+        </w:rPr>
+      </w:pPr>
+      <w:r>
+        <w:rPr>
+          <w:rFonts w:ascii="Consolas" w:hAnsi="Consolas"/>
+          <w:sz w:val="19"/>
+        </w:rPr>
+        <w:t xml:space="preserve">                string? input = Console.ReadLine();</w:t>
+      </w:r>
+    </w:p>
+    <w:p>
+      <w:pPr>
+        <w:pStyle w:val="NoSpacing"/>
+        <w:rPr>
+          <w:rFonts w:ascii="Consolas" w:hAnsi="Consolas"/>
+          <w:sz w:val="19"/>
+        </w:rPr>
+      </w:pPr>
+      <w:r>
+        <w:rPr>
+          <w:rFonts w:ascii="Consolas" w:hAnsi="Consolas"/>
+          <w:sz w:val="19"/>
+        </w:rPr>
+        <w:t xml:space="preserve">                if (string.IsNullOrWhiteSpace(input)) continue;</w:t>
+      </w:r>
+    </w:p>
+    <w:p>
+      <w:pPr>
+        <w:pStyle w:val="NoSpacing"/>
+        <w:rPr>
+          <w:rFonts w:ascii="Consolas" w:hAnsi="Consolas"/>
+          <w:sz w:val="19"/>
+        </w:rPr>
+      </w:pPr>
+      <w:r>
+        <w:rPr>
+          <w:rFonts w:ascii="Consolas" w:hAnsi="Consolas"/>
+          <w:sz w:val="19"/>
+        </w:rPr>
+        <w:t xml:space="preserve">                if (input.Equals("exit", StringComparison.OrdinalIgnoreCase)) break;</w:t>
+      </w:r>
+    </w:p>
+    <w:p>
+      <w:pPr>
+        <w:pStyle w:val="NoSpacing"/>
+        <w:rPr>
+          <w:rFonts w:ascii="Consolas" w:hAnsi="Consolas"/>
+          <w:sz w:val="19"/>
+        </w:rPr>
+      </w:pPr>
+    </w:p>
+    <w:p>
+      <w:pPr>
+        <w:pStyle w:val="NoSpacing"/>
+        <w:rPr>
+          <w:rFonts w:ascii="Consolas" w:hAnsi="Consolas"/>
+          <w:sz w:val="19"/>
+        </w:rPr>
+      </w:pPr>
+      <w:r>
+        <w:rPr>
+          <w:rFonts w:ascii="Consolas" w:hAnsi="Consolas"/>
+          <w:sz w:val="19"/>
+        </w:rPr>
+        <w:t xml:space="preserve">                // Step A: The Agent responds using the currently loaded memory</w:t>
+      </w:r>
+    </w:p>
+    <w:p>
+      <w:pPr>
+        <w:pStyle w:val="NoSpacing"/>
+        <w:rPr>
+          <w:rFonts w:ascii="Consolas" w:hAnsi="Consolas"/>
+          <w:sz w:val="19"/>
+        </w:rPr>
+      </w:pPr>
+      <w:r>
+        <w:rPr>
+          <w:rFonts w:ascii="Consolas" w:hAnsi="Consolas"/>
+          <w:sz w:val="19"/>
+        </w:rPr>
+        <w:t xml:space="preserve">                string response = await memoryAgent.ChatAsync(input, memoryManager.CurrentMemory);</w:t>
+      </w:r>
+    </w:p>
+    <w:p>
+      <w:pPr>
+        <w:pStyle w:val="NoSpacing"/>
+        <w:rPr>
+          <w:rFonts w:ascii="Consolas" w:hAnsi="Consolas"/>
+          <w:sz w:val="19"/>
+        </w:rPr>
+      </w:pPr>
+      <w:r>
+        <w:rPr>
+          <w:rFonts w:ascii="Consolas" w:hAnsi="Consolas"/>
+          <w:sz w:val="19"/>
+        </w:rPr>
+        <w:t xml:space="preserve">                Console.WriteLine($"\nAI {response}");</w:t>
+      </w:r>
+    </w:p>
+    <w:p>
+      <w:pPr>
+        <w:pStyle w:val="NoSpacing"/>
+        <w:rPr>
+          <w:rFonts w:ascii="Consolas" w:hAnsi="Consolas"/>
+          <w:sz w:val="19"/>
+        </w:rPr>
+      </w:pPr>
+    </w:p>
+    <w:p>
+      <w:pPr>
+        <w:pStyle w:val="NoSpacing"/>
+        <w:rPr>
+          <w:rFonts w:ascii="Consolas" w:hAnsi="Consolas"/>
+          <w:sz w:val="19"/>
+        </w:rPr>
+      </w:pPr>
+      <w:r>
+        <w:rPr>
+          <w:rFonts w:ascii="Consolas" w:hAnsi="Consolas"/>
+          <w:sz w:val="19"/>
+        </w:rPr>
+        <w:t xml:space="preserve">                // Step B: Fire-and-forget extraction in the background</w:t>
+      </w:r>
+    </w:p>
+    <w:p>
+      <w:pPr>
+        <w:pStyle w:val="NoSpacing"/>
+        <w:rPr>
+          <w:rFonts w:ascii="Consolas" w:hAnsi="Consolas"/>
+          <w:sz w:val="19"/>
+        </w:rPr>
+      </w:pPr>
+      <w:r>
+        <w:rPr>
+          <w:rFonts w:ascii="Consolas" w:hAnsi="Consolas"/>
+          <w:sz w:val="19"/>
+        </w:rPr>
+        <w:t xml:space="preserve">                // We use await here to ensure it finishes before the next loop,</w:t>
+      </w:r>
+    </w:p>
+    <w:p>
+      <w:pPr>
+        <w:pStyle w:val="NoSpacing"/>
+        <w:rPr>
+          <w:rFonts w:ascii="Consolas" w:hAnsi="Consolas"/>
+          <w:sz w:val="19"/>
+        </w:rPr>
+      </w:pPr>
+      <w:r>
+        <w:rPr>
+          <w:rFonts w:ascii="Consolas" w:hAnsi="Consolas"/>
+          <w:sz w:val="19"/>
+        </w:rPr>
+        <w:t xml:space="preserve">                // but structurally this operates as a background processor.</w:t>
+      </w:r>
+    </w:p>
+    <w:p>
+      <w:pPr>
+        <w:pStyle w:val="NoSpacing"/>
+        <w:rPr>
+          <w:rFonts w:ascii="Consolas" w:hAnsi="Consolas"/>
+          <w:sz w:val="19"/>
+        </w:rPr>
+      </w:pPr>
+      <w:r>
+        <w:rPr>
+          <w:rFonts w:ascii="Consolas" w:hAnsi="Consolas"/>
+          <w:sz w:val="19"/>
+        </w:rPr>
+        <w:t xml:space="preserve">                await memoryManager.ExtractAndSaveFactAsync(input);</w:t>
+      </w:r>
+    </w:p>
+    <w:p>
+      <w:pPr>
+        <w:pStyle w:val="NoSpacing"/>
+        <w:rPr>
+          <w:rFonts w:ascii="Consolas" w:hAnsi="Consolas"/>
+          <w:sz w:val="19"/>
+        </w:rPr>
+      </w:pPr>
+      <w:r>
+        <w:rPr>
+          <w:rFonts w:ascii="Consolas" w:hAnsi="Consolas"/>
+          <w:sz w:val="19"/>
+        </w:rPr>
+        <w:t xml:space="preserve">                Console.WriteLine();</w:t>
+      </w:r>
+    </w:p>
+    <w:p>
+      <w:pPr>
+        <w:pStyle w:val="NoSpacing"/>
+        <w:rPr>
+          <w:rFonts w:ascii="Consolas" w:hAnsi="Consolas"/>
+          <w:sz w:val="19"/>
+        </w:rPr>
+      </w:pPr>
+      <w:r>
+        <w:rPr>
+          <w:rFonts w:ascii="Consolas" w:hAnsi="Consolas"/>
+          <w:sz w:val="19"/>
+        </w:rPr>
+        <w:t xml:space="preserve">            }</w:t>
+      </w:r>
+    </w:p>
+    <w:p>
+      <w:pPr>
+        <w:pStyle w:val="NoSpacing"/>
+        <w:rPr>
+          <w:rFonts w:ascii="Consolas" w:hAnsi="Consolas"/>
+          <w:sz w:val="19"/>
+        </w:rPr>
+      </w:pPr>
+      <w:r>
+        <w:rPr>
+          <w:rFonts w:ascii="Consolas" w:hAnsi="Consolas"/>
+          <w:sz w:val="19"/>
+        </w:rPr>
+        <w:t xml:space="preserve">        }</w:t>
+      </w:r>
+    </w:p>
+    <w:p>
+      <w:pPr>
+        <w:pStyle w:val="NoSpacing"/>
+        <w:rPr>
+          <w:rFonts w:ascii="Consolas" w:hAnsi="Consolas"/>
+          <w:sz w:val="19"/>
+        </w:rPr>
+      </w:pPr>
+      <w:r>
+        <w:rPr>
+          <w:rFonts w:ascii="Consolas" w:hAnsi="Consolas"/>
+          <w:sz w:val="19"/>
+        </w:rPr>
+        <w:t xml:space="preserve">    }</w:t>
+      </w:r>
+    </w:p>
+    <w:p>
+      <w:pPr>
+        <w:pStyle w:val="NoSpacing"/>
+        <w:rPr>
+          <w:rFonts w:ascii="Consolas" w:hAnsi="Consolas"/>
+          <w:sz w:val="19"/>
+        </w:rPr>
+      </w:pPr>
+      <w:r>
+        <w:rPr>
+          <w:rFonts w:ascii="Consolas" w:hAnsi="Consolas"/>
+          <w:sz w:val="19"/>
+        </w:rPr>
+        <w:t>}</w:t>
+      </w:r>
+    </w:p>
+    <w:p>
+      <w:pPr>
+        <w:rPr>
+          <w:b/>
+        </w:rPr>
+      </w:pPr>
+      <w:r>
+        <w:rPr>
+          <w:b/>
+        </w:rPr>
+        <w:t>UserMemory.cs</w:t>
+      </w:r>
+    </w:p>
+    <w:p>
+      <w:pPr>
+        <w:pStyle w:val="NoSpacing"/>
+        <w:rPr>
+          <w:rFonts w:ascii="Consolas" w:hAnsi="Consolas"/>
+          <w:sz w:val="19"/>
+        </w:rPr>
+      </w:pPr>
+      <w:r>
+        <w:rPr>
+          <w:rFonts w:ascii="Consolas" w:hAnsi="Consolas"/>
+          <w:sz w:val="19"/>
+        </w:rPr>
+        <w:t>// UserMemory</w:t>
+      </w:r>
+    </w:p>
+    <w:p>
+      <w:pPr>
+        <w:pStyle w:val="NoSpacing"/>
+        <w:rPr>
+          <w:rFonts w:ascii="Consolas" w:hAnsi="Consolas"/>
+          <w:sz w:val="19"/>
+        </w:rPr>
+      </w:pPr>
+      <w:r>
+        <w:rPr>
+          <w:rFonts w:ascii="Consolas" w:hAnsi="Consolas"/>
+          <w:sz w:val="19"/>
+        </w:rPr>
+        <w:t>// ---------------------------------------------------------------------------</w:t>
+      </w:r>
+    </w:p>
+    <w:p>
+      <w:pPr>
+        <w:pStyle w:val="NoSpacing"/>
+        <w:rPr>
+          <w:rFonts w:ascii="Consolas" w:hAnsi="Consolas"/>
+          <w:sz w:val="19"/>
+        </w:rPr>
+      </w:pPr>
+      <w:r>
+        <w:rPr>
+          <w:rFonts w:ascii="Consolas" w:hAnsi="Consolas"/>
+          <w:sz w:val="19"/>
+        </w:rPr>
+        <w:t>// The on-disk shape of an agent's long-term memory - a flat list of short</w:t>
+      </w:r>
+    </w:p>
+    <w:p>
+      <w:pPr>
+        <w:pStyle w:val="NoSpacing"/>
+        <w:rPr>
+          <w:rFonts w:ascii="Consolas" w:hAnsi="Consolas"/>
+          <w:sz w:val="19"/>
+        </w:rPr>
+      </w:pPr>
+      <w:r>
+        <w:rPr>
+          <w:rFonts w:ascii="Consolas" w:hAnsi="Consolas"/>
+          <w:sz w:val="19"/>
+        </w:rPr>
+        <w:t>// facts, serialized to/from user_memory.json by MemoryManager.</w:t>
+      </w:r>
+    </w:p>
+    <w:p>
+      <w:pPr>
+        <w:pStyle w:val="NoSpacing"/>
+        <w:rPr>
+          <w:rFonts w:ascii="Consolas" w:hAnsi="Consolas"/>
+          <w:sz w:val="19"/>
+        </w:rPr>
+      </w:pPr>
+      <w:r>
+        <w:rPr>
+          <w:rFonts w:ascii="Consolas" w:hAnsi="Consolas"/>
+          <w:sz w:val="19"/>
+        </w:rPr>
+        <w:t>using System.Text.Json.Serialization;</w:t>
+      </w:r>
+    </w:p>
+    <w:p>
+      <w:pPr>
+        <w:pStyle w:val="NoSpacing"/>
+        <w:rPr>
+          <w:rFonts w:ascii="Consolas" w:hAnsi="Consolas"/>
+          <w:sz w:val="19"/>
+        </w:rPr>
+      </w:pPr>
+    </w:p>
+    <w:p>
+      <w:pPr>
+        <w:pStyle w:val="NoSpacing"/>
+        <w:rPr>
+          <w:rFonts w:ascii="Consolas" w:hAnsi="Consolas"/>
+          <w:sz w:val="19"/>
+        </w:rPr>
+      </w:pPr>
+      <w:r>
+        <w:rPr>
+          <w:rFonts w:ascii="Consolas" w:hAnsi="Consolas"/>
+          <w:sz w:val="19"/>
+        </w:rPr>
+        <w:t>namespace LongTermMemory</w:t>
+      </w:r>
+    </w:p>
+    <w:p>
+      <w:pPr>
+        <w:pStyle w:val="NoSpacing"/>
+        <w:rPr>
+          <w:rFonts w:ascii="Consolas" w:hAnsi="Consolas"/>
+          <w:sz w:val="19"/>
+        </w:rPr>
+      </w:pPr>
+      <w:r>
+        <w:rPr>
+          <w:rFonts w:ascii="Consolas" w:hAnsi="Consolas"/>
+          <w:sz w:val="19"/>
+        </w:rPr>
+        <w:t>{</w:t>
+      </w:r>
+    </w:p>
+    <w:p>
+      <w:pPr>
+        <w:pStyle w:val="NoSpacing"/>
+        <w:rPr>
+          <w:rFonts w:ascii="Consolas" w:hAnsi="Consolas"/>
+          <w:sz w:val="19"/>
+        </w:rPr>
+      </w:pPr>
+      <w:r>
+        <w:rPr>
+          <w:rFonts w:ascii="Consolas" w:hAnsi="Consolas"/>
+          <w:sz w:val="19"/>
+        </w:rPr>
+        <w:t xml:space="preserve">    internal class UserMemory</w:t>
+      </w:r>
+    </w:p>
+    <w:p>
+      <w:pPr>
+        <w:pStyle w:val="NoSpacing"/>
+        <w:rPr>
+          <w:rFonts w:ascii="Consolas" w:hAnsi="Consolas"/>
+          <w:sz w:val="19"/>
+        </w:rPr>
+      </w:pPr>
+      <w:r>
+        <w:rPr>
+          <w:rFonts w:ascii="Consolas" w:hAnsi="Consolas"/>
+          <w:sz w:val="19"/>
+        </w:rPr>
+        <w:t xml:space="preserve">    {</w:t>
+      </w:r>
+    </w:p>
+    <w:p>
+      <w:pPr>
+        <w:pStyle w:val="NoSpacing"/>
+        <w:rPr>
+          <w:rFonts w:ascii="Consolas" w:hAnsi="Consolas"/>
+          <w:sz w:val="19"/>
+        </w:rPr>
+      </w:pPr>
       <w:r>
         <w:rPr>
           <w:rFonts w:ascii="Consolas" w:hAnsi="Consolas"/>
           <w:sz w:val="19"/>
         </w:rPr>
         <w:lastRenderedPageBreak/>
-        <w:t xml:space="preserve">         // 1. Initialize the Kernel</w:t>
-      </w:r>
-    </w:p>
-    <w:p>
-      <w:pPr>
-        <w:pStyle w:val="NoSpacing"/>
-        <w:rPr>
-          <w:rFonts w:ascii="Consolas" w:hAnsi="Consolas"/>
-          <w:sz w:val="19"/>
-        </w:rPr>
-      </w:pPr>
-      <w:r>
-        <w:rPr>
-          <w:rFonts w:ascii="Consolas" w:hAnsi="Consolas"/>
-          <w:sz w:val="19"/>
-        </w:rPr>
-        <w:t xml:space="preserve">            IKernelBuilder builder = Kernel.CreateBuilder();</w:t>
-      </w:r>
-    </w:p>
-    <w:p>
-      <w:pPr>
-        <w:pStyle w:val="NoSpacing"/>
-        <w:rPr>
-          <w:rFonts w:ascii="Consolas" w:hAnsi="Consolas"/>
-          <w:sz w:val="19"/>
-        </w:rPr>
-      </w:pPr>
-      <w:r>
-        <w:rPr>
-          <w:rFonts w:ascii="Consolas" w:hAnsi="Consolas"/>
-          <w:sz w:val="19"/>
-        </w:rPr>
-        <w:t xml:space="preserve">            string apiKey = Environment.GetEnvironmentVariable("GEMINI_API_KEY")</w:t>
-      </w:r>
-    </w:p>
-    <w:p>
-      <w:pPr>
-        <w:pStyle w:val="NoSpacing"/>
-        <w:rPr>
-          <w:rFonts w:ascii="Consolas" w:hAnsi="Consolas"/>
-          <w:sz w:val="19"/>
-        </w:rPr>
-      </w:pPr>
-      <w:r>
-        <w:rPr>
-          <w:rFonts w:ascii="Consolas" w:hAnsi="Consolas"/>
-          <w:sz w:val="19"/>
-        </w:rPr>
-        <w:t xml:space="preserve">                ?? throw new Exception("GEMINI_API_KEY is missing");</w:t>
-      </w:r>
-    </w:p>
-    <w:p>
-      <w:pPr>
-        <w:pStyle w:val="NoSpacing"/>
-        <w:rPr>
-          <w:rFonts w:ascii="Consolas" w:hAnsi="Consolas"/>
-          <w:sz w:val="19"/>
-        </w:rPr>
-      </w:pPr>
-    </w:p>
-    <w:p>
-      <w:pPr>
-        <w:pStyle w:val="NoSpacing"/>
-        <w:rPr>
-          <w:rFonts w:ascii="Consolas" w:hAnsi="Consolas"/>
-          <w:sz w:val="19"/>
-        </w:rPr>
-      </w:pPr>
-      <w:r>
-        <w:rPr>
-          <w:rFonts w:ascii="Consolas" w:hAnsi="Consolas"/>
-          <w:sz w:val="19"/>
-        </w:rPr>
-        <w:t xml:space="preserve">            builder.AddGoogleAIGeminiChatCompletion("gemini-2.5-flash", apiKey);</w:t>
-      </w:r>
-    </w:p>
-    <w:p>
-      <w:pPr>
-        <w:pStyle w:val="NoSpacing"/>
-        <w:rPr>
-          <w:rFonts w:ascii="Consolas" w:hAnsi="Consolas"/>
-          <w:sz w:val="19"/>
-        </w:rPr>
-      </w:pPr>
-      <w:r>
-        <w:rPr>
-          <w:rFonts w:ascii="Consolas" w:hAnsi="Consolas"/>
-          <w:sz w:val="19"/>
-        </w:rPr>
-        <w:t xml:space="preserve">            Kernel kernel = builder.Build();</w:t>
-      </w:r>
-    </w:p>
-    <w:p>
-      <w:pPr>
-        <w:pStyle w:val="NoSpacing"/>
-        <w:rPr>
-          <w:rFonts w:ascii="Consolas" w:hAnsi="Consolas"/>
-          <w:sz w:val="19"/>
-        </w:rPr>
-      </w:pPr>
-    </w:p>
-    <w:p>
-      <w:pPr>
-        <w:pStyle w:val="NoSpacing"/>
-        <w:rPr>
-          <w:rFonts w:ascii="Consolas" w:hAnsi="Consolas"/>
-          <w:sz w:val="19"/>
-        </w:rPr>
-      </w:pPr>
-      <w:r>
-        <w:rPr>
-          <w:rFonts w:ascii="Consolas" w:hAnsi="Consolas"/>
-          <w:sz w:val="19"/>
-        </w:rPr>
-        <w:t xml:space="preserve">            var chatService = kernel.GetRequiredService&lt;IChatCompletionService&gt;();</w:t>
-      </w:r>
-    </w:p>
-    <w:p>
-      <w:pPr>
-        <w:pStyle w:val="NoSpacing"/>
-        <w:rPr>
-          <w:rFonts w:ascii="Consolas" w:hAnsi="Consolas"/>
-          <w:sz w:val="19"/>
-        </w:rPr>
-      </w:pPr>
-    </w:p>
-    <w:p>
-      <w:pPr>
-        <w:pStyle w:val="NoSpacing"/>
-        <w:rPr>
-          <w:rFonts w:ascii="Consolas" w:hAnsi="Consolas"/>
-          <w:sz w:val="19"/>
-        </w:rPr>
-      </w:pPr>
-      <w:r>
-        <w:rPr>
-          <w:rFonts w:ascii="Consolas" w:hAnsi="Consolas"/>
-          <w:sz w:val="19"/>
-        </w:rPr>
-        <w:t xml:space="preserve">            // 2. Initialize Components</w:t>
-      </w:r>
-    </w:p>
-    <w:p>
-      <w:pPr>
-        <w:pStyle w:val="NoSpacing"/>
-        <w:rPr>
-          <w:rFonts w:ascii="Consolas" w:hAnsi="Consolas"/>
-          <w:sz w:val="19"/>
-        </w:rPr>
-      </w:pPr>
-      <w:r>
-        <w:rPr>
-          <w:rFonts w:ascii="Consolas" w:hAnsi="Consolas"/>
-          <w:sz w:val="19"/>
-        </w:rPr>
-        <w:t xml:space="preserve">            var memoryManager = new MemoryManager(chatService);</w:t>
-      </w:r>
-    </w:p>
-    <w:p>
-      <w:pPr>
-        <w:pStyle w:val="NoSpacing"/>
-        <w:rPr>
-          <w:rFonts w:ascii="Consolas" w:hAnsi="Consolas"/>
-          <w:sz w:val="19"/>
-        </w:rPr>
-      </w:pPr>
-      <w:r>
-        <w:rPr>
-          <w:rFonts w:ascii="Consolas" w:hAnsi="Consolas"/>
-          <w:sz w:val="19"/>
-        </w:rPr>
-        <w:t xml:space="preserve">            var memoryAgent = new MemoryAgent(chatService);</w:t>
-      </w:r>
-    </w:p>
-    <w:p>
-      <w:pPr>
-        <w:pStyle w:val="NoSpacing"/>
-        <w:rPr>
-          <w:rFonts w:ascii="Consolas" w:hAnsi="Consolas"/>
-          <w:sz w:val="19"/>
-        </w:rPr>
-      </w:pPr>
-    </w:p>
-    <w:p>
-      <w:pPr>
-        <w:pStyle w:val="NoSpacing"/>
-        <w:rPr>
-          <w:rFonts w:ascii="Consolas" w:hAnsi="Consolas"/>
-          <w:sz w:val="19"/>
-        </w:rPr>
-      </w:pPr>
-      <w:r>
-        <w:rPr>
-          <w:rFonts w:ascii="Consolas" w:hAnsi="Consolas"/>
-          <w:sz w:val="19"/>
-        </w:rPr>
-        <w:t xml:space="preserve">            Console.WriteLine("Long-Term memory agent online");</w:t>
-      </w:r>
-    </w:p>
-    <w:p>
-      <w:pPr>
-        <w:pStyle w:val="NoSpacing"/>
-        <w:rPr>
-          <w:rFonts w:ascii="Consolas" w:hAnsi="Consolas"/>
-          <w:sz w:val="19"/>
-        </w:rPr>
-      </w:pPr>
-      <w:r>
-        <w:rPr>
-          <w:rFonts w:ascii="Consolas" w:hAnsi="Consolas"/>
-          <w:sz w:val="19"/>
-        </w:rPr>
-        <w:t xml:space="preserve">    </w:t>
-      </w:r>
+        <w:t xml:space="preserve">        /// &lt;summary&gt;</w:t>
+      </w:r>
+    </w:p>
+    <w:p>
+      <w:pPr>
+        <w:pStyle w:val="NoSpacing"/>
+        <w:rPr>
+          <w:rFonts w:ascii="Consolas" w:hAnsi="Consolas"/>
+          <w:sz w:val="19"/>
+        </w:rPr>
+      </w:pPr>
+      <w:r>
+        <w:rPr>
+          <w:rFonts w:ascii="Consolas" w:hAnsi="Consolas"/>
+          <w:sz w:val="19"/>
+        </w:rPr>
+        <w:t xml:space="preserve">        /// The data structure representing the agetn's long-term storage.</w:t>
+      </w:r>
+    </w:p>
+    <w:p>
+      <w:pPr>
+        <w:pStyle w:val="NoSpacing"/>
+        <w:rPr>
+          <w:rFonts w:ascii="Consolas" w:hAnsi="Consolas"/>
+          <w:sz w:val="19"/>
+        </w:rPr>
+      </w:pPr>
+      <w:r>
+        <w:rPr>
+          <w:rFonts w:ascii="Consolas" w:hAnsi="Consolas"/>
+          <w:sz w:val="19"/>
+        </w:rPr>
+        <w:t xml:space="preserve">        /// &lt;/summary&gt;</w:t>
+      </w:r>
+    </w:p>
+    <w:p>
+      <w:pPr>
+        <w:pStyle w:val="NoSpacing"/>
+        <w:rPr>
+          <w:rFonts w:ascii="Consolas" w:hAnsi="Consolas"/>
+          <w:sz w:val="19"/>
+        </w:rPr>
+      </w:pPr>
+      <w:r>
+        <w:rPr>
+          <w:rFonts w:ascii="Consolas" w:hAnsi="Consolas"/>
+          <w:sz w:val="19"/>
+        </w:rPr>
+        <w:t xml:space="preserve">        [JsonPropertyName("facts")]</w:t>
+      </w:r>
+    </w:p>
+    <w:p>
+      <w:pPr>
+        <w:pStyle w:val="NoSpacing"/>
+        <w:rPr>
+          <w:rFonts w:ascii="Consolas" w:hAnsi="Consolas"/>
+          <w:sz w:val="19"/>
+        </w:rPr>
+      </w:pPr>
+      <w:r>
+        <w:rPr>
+          <w:rFonts w:ascii="Consolas" w:hAnsi="Consolas"/>
+          <w:sz w:val="19"/>
+        </w:rPr>
+        <w:t xml:space="preserve">        public List&lt;string&gt; Facts { get; set; } = new List&lt;string&gt;();</w:t>
+      </w:r>
+    </w:p>
+    <w:p>
+      <w:pPr>
+        <w:pStyle w:val="NoSpacing"/>
+        <w:rPr>
+          <w:rFonts w:ascii="Consolas" w:hAnsi="Consolas"/>
+          <w:sz w:val="19"/>
+        </w:rPr>
+      </w:pPr>
+      <w:r>
+        <w:rPr>
+          <w:rFonts w:ascii="Consolas" w:hAnsi="Consolas"/>
+          <w:sz w:val="19"/>
+        </w:rPr>
+        <w:t xml:space="preserve">    }</w:t>
+      </w:r>
+    </w:p>
+    <w:p>
+      <w:pPr>
+        <w:pStyle w:val="NoSpacing"/>
+        <w:rPr>
+          <w:rFonts w:ascii="Consolas" w:hAnsi="Consolas"/>
+          <w:sz w:val="19"/>
+        </w:rPr>
+      </w:pPr>
+      <w:r>
+        <w:rPr>
+          <w:rFonts w:ascii="Consolas" w:hAnsi="Consolas"/>
+          <w:sz w:val="19"/>
+        </w:rPr>
+        <w:t>}</w:t>
+      </w:r>
+    </w:p>
+    <w:p>
+      <w:pPr>
+        <w:rPr>
+          <w:b/>
+        </w:rPr>
+      </w:pPr>
+      <w:r>
+        <w:rPr>
+          <w:b/>
+        </w:rPr>
+        <w:t>MemoryManager.cs</w:t>
+      </w:r>
+    </w:p>
+    <w:p>
+      <w:pPr>
+        <w:pStyle w:val="NoSpacing"/>
+        <w:rPr>
+          <w:rFonts w:ascii="Consolas" w:hAnsi="Consolas"/>
+          <w:sz w:val="19"/>
+        </w:rPr>
+      </w:pPr>
+      <w:r>
+        <w:rPr>
+          <w:rFonts w:ascii="Consolas" w:hAnsi="Consolas"/>
+          <w:sz w:val="19"/>
+        </w:rPr>
+        <w:t>// MemoryManager</w:t>
+      </w:r>
+    </w:p>
+    <w:p>
+      <w:pPr>
+        <w:pStyle w:val="NoSpacing"/>
+        <w:rPr>
+          <w:rFonts w:ascii="Consolas" w:hAnsi="Consolas"/>
+          <w:sz w:val="19"/>
+        </w:rPr>
+      </w:pPr>
+      <w:r>
+        <w:rPr>
+          <w:rFonts w:ascii="Consolas" w:hAnsi="Consolas"/>
+          <w:sz w:val="19"/>
+        </w:rPr>
+        <w:t>// ---------------------------------------------------------------------------</w:t>
+      </w:r>
+    </w:p>
+    <w:p>
+      <w:pPr>
+        <w:pStyle w:val="NoSpacing"/>
+        <w:rPr>
+          <w:rFonts w:ascii="Consolas" w:hAnsi="Consolas"/>
+          <w:sz w:val="19"/>
+        </w:rPr>
+      </w:pPr>
+      <w:r>
+        <w:rPr>
+          <w:rFonts w:ascii="Consolas" w:hAnsi="Consolas"/>
+          <w:sz w:val="19"/>
+        </w:rPr>
+        <w:t>// Owns the agent's persistent memory file: loads it on startup, uses a</w:t>
+      </w:r>
+    </w:p>
+    <w:p>
+      <w:pPr>
+        <w:pStyle w:val="NoSpacing"/>
+        <w:rPr>
+          <w:rFonts w:ascii="Consolas" w:hAnsi="Consolas"/>
+          <w:sz w:val="19"/>
+        </w:rPr>
+      </w:pPr>
+      <w:r>
+        <w:rPr>
+          <w:rFonts w:ascii="Consolas" w:hAnsi="Consolas"/>
+          <w:sz w:val="19"/>
+        </w:rPr>
+        <w:t>// dedicated extraction prompt to decide whether a user's message contains a</w:t>
+      </w:r>
+    </w:p>
+    <w:p>
+      <w:pPr>
+        <w:pStyle w:val="NoSpacing"/>
+        <w:rPr>
+          <w:rFonts w:ascii="Consolas" w:hAnsi="Consolas"/>
+          <w:sz w:val="19"/>
+        </w:rPr>
+      </w:pPr>
+      <w:r>
+        <w:rPr>
+          <w:rFonts w:ascii="Consolas" w:hAnsi="Consolas"/>
+          <w:sz w:val="19"/>
+        </w:rPr>
+        <w:t>// durable fact worth remembering, and saves it back to disk when it does -</w:t>
+      </w:r>
+    </w:p>
+    <w:p>
+      <w:pPr>
+        <w:pStyle w:val="NoSpacing"/>
+        <w:rPr>
+          <w:rFonts w:ascii="Consolas" w:hAnsi="Consolas"/>
+          <w:sz w:val="19"/>
+        </w:rPr>
+      </w:pPr>
+      <w:r>
+        <w:rPr>
+          <w:rFonts w:ascii="Consolas" w:hAnsi="Consolas"/>
+          <w:sz w:val="19"/>
+        </w:rPr>
+        <w:t>// giving the agent memory that survives past the current process.</w:t>
+      </w:r>
+    </w:p>
+    <w:p>
+      <w:pPr>
+        <w:pStyle w:val="NoSpacing"/>
+        <w:rPr>
+          <w:rFonts w:ascii="Consolas" w:hAnsi="Consolas"/>
+          <w:sz w:val="19"/>
+        </w:rPr>
+      </w:pPr>
+      <w:r>
+        <w:rPr>
+          <w:rFonts w:ascii="Consolas" w:hAnsi="Consolas"/>
+          <w:sz w:val="19"/>
+        </w:rPr>
+        <w:t>using Microsoft.SemanticKernel.ChatCompletion;</w:t>
+      </w:r>
+    </w:p>
+    <w:p>
+      <w:pPr>
+        <w:pStyle w:val="NoSpacing"/>
+        <w:rPr>
+          <w:rFonts w:ascii="Consolas" w:hAnsi="Consolas"/>
+          <w:sz w:val="19"/>
+        </w:rPr>
+      </w:pPr>
+      <w:r>
+        <w:rPr>
+          <w:rFonts w:ascii="Consolas" w:hAnsi="Consolas"/>
+          <w:sz w:val="19"/>
+        </w:rPr>
+        <w:t>using System.Text.Json;</w:t>
+      </w:r>
+    </w:p>
+    <w:p>
+      <w:pPr>
+        <w:pStyle w:val="NoSpacing"/>
+        <w:rPr>
+          <w:rFonts w:ascii="Consolas" w:hAnsi="Consolas"/>
+          <w:sz w:val="19"/>
+        </w:rPr>
+      </w:pPr>
+    </w:p>
+    <w:p>
+      <w:pPr>
+        <w:pStyle w:val="NoSpacing"/>
+        <w:rPr>
+          <w:rFonts w:ascii="Consolas" w:hAnsi="Consolas"/>
+          <w:sz w:val="19"/>
+        </w:rPr>
+      </w:pPr>
+      <w:r>
+        <w:rPr>
+          <w:rFonts w:ascii="Consolas" w:hAnsi="Consolas"/>
+          <w:sz w:val="19"/>
+        </w:rPr>
+        <w:t>namespace LongTermMemory</w:t>
+      </w:r>
+    </w:p>
+    <w:p>
+      <w:pPr>
+        <w:pStyle w:val="NoSpacing"/>
+        <w:rPr>
+          <w:rFonts w:ascii="Consolas" w:hAnsi="Consolas"/>
+          <w:sz w:val="19"/>
+        </w:rPr>
+      </w:pPr>
+      <w:r>
+        <w:rPr>
+          <w:rFonts w:ascii="Consolas" w:hAnsi="Consolas"/>
+          <w:sz w:val="19"/>
+        </w:rPr>
+        <w:t>{</w:t>
+      </w:r>
+    </w:p>
+    <w:p>
+      <w:pPr>
+        <w:pStyle w:val="NoSpacing"/>
+        <w:rPr>
+          <w:rFonts w:ascii="Consolas" w:hAnsi="Consolas"/>
+          <w:sz w:val="19"/>
+        </w:rPr>
+      </w:pPr>
+      <w:r>
+        <w:rPr>
+          <w:rFonts w:ascii="Consolas" w:hAnsi="Consolas"/>
+          <w:sz w:val="19"/>
+        </w:rPr>
+        <w:t xml:space="preserve">    /// &lt;summary&gt;</w:t>
+      </w:r>
+    </w:p>
+    <w:p>
+      <w:pPr>
+        <w:pStyle w:val="NoSpacing"/>
+        <w:rPr>
+          <w:rFonts w:ascii="Consolas" w:hAnsi="Consolas"/>
+          <w:sz w:val="19"/>
+        </w:rPr>
+      </w:pPr>
+      <w:r>
+        <w:rPr>
+          <w:rFonts w:ascii="Consolas" w:hAnsi="Consolas"/>
+          <w:sz w:val="19"/>
+        </w:rPr>
+        <w:t xml:space="preserve">    /// Handles loading, saving, and extracting permanent facts from the conversation</w:t>
+      </w:r>
+    </w:p>
+    <w:p>
+      <w:pPr>
+        <w:pStyle w:val="NoSpacing"/>
+        <w:rPr>
+          <w:rFonts w:ascii="Consolas" w:hAnsi="Consolas"/>
+          <w:sz w:val="19"/>
+        </w:rPr>
+      </w:pPr>
+      <w:r>
+        <w:rPr>
+          <w:rFonts w:ascii="Consolas" w:hAnsi="Consolas"/>
+          <w:sz w:val="19"/>
+        </w:rPr>
+        <w:t xml:space="preserve">    /// &lt;/summary&gt;</w:t>
+      </w:r>
+    </w:p>
+    <w:p>
+      <w:pPr>
+        <w:pStyle w:val="NoSpacing"/>
+        <w:rPr>
+          <w:rFonts w:ascii="Consolas" w:hAnsi="Consolas"/>
+          <w:sz w:val="19"/>
+        </w:rPr>
+      </w:pPr>
+      <w:r>
+        <w:rPr>
+          <w:rFonts w:ascii="Consolas" w:hAnsi="Consolas"/>
+          <w:sz w:val="19"/>
+        </w:rPr>
+        <w:t xml:space="preserve">    internal class MemoryManager</w:t>
+      </w:r>
+    </w:p>
+    <w:p>
+      <w:pPr>
+        <w:pStyle w:val="NoSpacing"/>
+        <w:rPr>
+          <w:rFonts w:ascii="Consolas" w:hAnsi="Consolas"/>
+          <w:sz w:val="19"/>
+        </w:rPr>
+      </w:pPr>
+      <w:r>
+        <w:rPr>
+          <w:rFonts w:ascii="Consolas" w:hAnsi="Consolas"/>
+          <w:sz w:val="19"/>
+        </w:rPr>
+        <w:t xml:space="preserve">    {</w:t>
+      </w:r>
+    </w:p>
+    <w:p>
+      <w:pPr>
+        <w:pStyle w:val="NoSpacing"/>
+        <w:rPr>
+          <w:rFonts w:ascii="Consolas" w:hAnsi="Consolas"/>
+          <w:sz w:val="19"/>
+        </w:rPr>
+      </w:pPr>
+      <w:r>
+        <w:rPr>
+          <w:rFonts w:ascii="Consolas" w:hAnsi="Consolas"/>
+          <w:sz w:val="19"/>
+        </w:rPr>
+        <w:t xml:space="preserve">        private readonly string _filePath;</w:t>
+      </w:r>
+    </w:p>
+    <w:p>
+      <w:pPr>
+        <w:pStyle w:val="NoSpacing"/>
+        <w:rPr>
+          <w:rFonts w:ascii="Consolas" w:hAnsi="Consolas"/>
+          <w:sz w:val="19"/>
+        </w:rPr>
+      </w:pPr>
+      <w:r>
+        <w:rPr>
+          <w:rFonts w:ascii="Consolas" w:hAnsi="Consolas"/>
+          <w:sz w:val="19"/>
+        </w:rPr>
+        <w:t xml:space="preserve">        private readonly IChatCompletionService _chatService;</w:t>
+      </w:r>
+    </w:p>
+    <w:p>
+      <w:pPr>
+        <w:pStyle w:val="NoSpacing"/>
+        <w:rPr>
+          <w:rFonts w:ascii="Consolas" w:hAnsi="Consolas"/>
+          <w:sz w:val="19"/>
+        </w:rPr>
+      </w:pPr>
+    </w:p>
+    <w:p>
+      <w:pPr>
+        <w:pStyle w:val="NoSpacing"/>
+        <w:rPr>
+          <w:rFonts w:ascii="Consolas" w:hAnsi="Consolas"/>
+          <w:sz w:val="19"/>
+        </w:rPr>
+      </w:pPr>
+      <w:r>
+        <w:rPr>
+          <w:rFonts w:ascii="Consolas" w:hAnsi="Consolas"/>
+          <w:sz w:val="19"/>
+        </w:rPr>
+        <w:t xml:space="preserve">        public UserMemory CurrentMemory { get; private set;  }</w:t>
+      </w:r>
+    </w:p>
+    <w:p>
+      <w:pPr>
+        <w:pStyle w:val="NoSpacing"/>
+        <w:rPr>
+          <w:rFonts w:ascii="Consolas" w:hAnsi="Consolas"/>
+          <w:sz w:val="19"/>
+        </w:rPr>
+      </w:pPr>
+    </w:p>
+    <w:p>
+      <w:pPr>
+        <w:pStyle w:val="NoSpacing"/>
+        <w:rPr>
+          <w:rFonts w:ascii="Consolas" w:hAnsi="Consolas"/>
+          <w:sz w:val="19"/>
+        </w:rPr>
+      </w:pPr>
+      <w:r>
+        <w:rPr>
+          <w:rFonts w:ascii="Consolas" w:hAnsi="Consolas"/>
+          <w:sz w:val="19"/>
+        </w:rPr>
+        <w:t xml:space="preserve">        public MemoryManager(IChatCompletionService chatService, string filePath = "user_memory.json")</w:t>
+      </w:r>
+    </w:p>
+    <w:p>
+      <w:pPr>
+        <w:pStyle w:val="NoSpacing"/>
+        <w:rPr>
+          <w:rFonts w:ascii="Consolas" w:hAnsi="Consolas"/>
+          <w:sz w:val="19"/>
+        </w:rPr>
+      </w:pPr>
+      <w:r>
+        <w:rPr>
+          <w:rFonts w:ascii="Consolas" w:hAnsi="Consolas"/>
+          <w:sz w:val="19"/>
+        </w:rPr>
+        <w:t xml:space="preserve">        {</w:t>
+      </w:r>
+    </w:p>
+    <w:p>
+      <w:pPr>
+        <w:pStyle w:val="NoSpacing"/>
+        <w:rPr>
+          <w:rFonts w:ascii="Consolas" w:hAnsi="Consolas"/>
+          <w:sz w:val="19"/>
+        </w:rPr>
+      </w:pPr>
+      <w:r>
+        <w:rPr>
+          <w:rFonts w:ascii="Consolas" w:hAnsi="Consolas"/>
+          <w:sz w:val="19"/>
+        </w:rPr>
+        <w:t xml:space="preserve">            _chatService = chatService;</w:t>
+      </w:r>
+    </w:p>
+    <w:p>
+      <w:pPr>
+        <w:pStyle w:val="NoSpacing"/>
+        <w:rPr>
+          <w:rFonts w:ascii="Consolas" w:hAnsi="Consolas"/>
+          <w:sz w:val="19"/>
+        </w:rPr>
+      </w:pPr>
+      <w:r>
+        <w:rPr>
+          <w:rFonts w:ascii="Consolas" w:hAnsi="Consolas"/>
+          <w:sz w:val="19"/>
+        </w:rPr>
+        <w:t xml:space="preserve">            _filePath = filePath;</w:t>
+      </w:r>
+    </w:p>
+    <w:p>
+      <w:pPr>
+        <w:pStyle w:val="NoSpacing"/>
+        <w:rPr>
+          <w:rFonts w:ascii="Consolas" w:hAnsi="Consolas"/>
+          <w:sz w:val="19"/>
+        </w:rPr>
+      </w:pPr>
+      <w:r>
+        <w:rPr>
+          <w:rFonts w:ascii="Consolas" w:hAnsi="Consolas"/>
+          <w:sz w:val="19"/>
+        </w:rPr>
+        <w:t xml:space="preserve">            CurrentMemory = LoadMemory();</w:t>
+      </w:r>
+    </w:p>
+    <w:p>
+      <w:pPr>
+        <w:pStyle w:val="NoSpacing"/>
+        <w:rPr>
+          <w:rFonts w:ascii="Consolas" w:hAnsi="Consolas"/>
+          <w:sz w:val="19"/>
+        </w:rPr>
+      </w:pPr>
+      <w:r>
+        <w:rPr>
+          <w:rFonts w:ascii="Consolas" w:hAnsi="Consolas"/>
+          <w:sz w:val="19"/>
+        </w:rPr>
+        <w:t xml:space="preserve">        }</w:t>
+      </w:r>
+    </w:p>
+    <w:p>
+      <w:pPr>
+        <w:pStyle w:val="NoSpacing"/>
+        <w:rPr>
+          <w:rFonts w:ascii="Consolas" w:hAnsi="Consolas"/>
+          <w:sz w:val="19"/>
+        </w:rPr>
+      </w:pPr>
+    </w:p>
+    <w:p>
+      <w:pPr>
+        <w:pStyle w:val="NoSpacing"/>
+        <w:rPr>
+          <w:rFonts w:ascii="Consolas" w:hAnsi="Consolas"/>
+          <w:sz w:val="19"/>
+        </w:rPr>
+      </w:pPr>
+      <w:r>
+        <w:rPr>
+          <w:rFonts w:ascii="Consolas" w:hAnsi="Consolas"/>
+          <w:sz w:val="19"/>
+        </w:rPr>
+        <w:t xml:space="preserve">        // Reads the memory file from disk if it exists; otherwise starts fresh</w:t>
+      </w:r>
+    </w:p>
+    <w:p>
+      <w:pPr>
+        <w:pStyle w:val="NoSpacing"/>
+        <w:rPr>
+          <w:rFonts w:ascii="Consolas" w:hAnsi="Consolas"/>
+          <w:sz w:val="19"/>
+        </w:rPr>
+      </w:pPr>
+      <w:r>
+        <w:rPr>
+          <w:rFonts w:ascii="Consolas" w:hAnsi="Consolas"/>
+          <w:sz w:val="19"/>
+        </w:rPr>
+        <w:t xml:space="preserve">        // with an empty fact list rather than failing on first run. Also falls</w:t>
+      </w:r>
+    </w:p>
+    <w:p>
+      <w:pPr>
+        <w:pStyle w:val="NoSpacing"/>
+        <w:rPr>
+          <w:rFonts w:ascii="Consolas" w:hAnsi="Consolas"/>
+          <w:sz w:val="19"/>
+        </w:rPr>
+      </w:pPr>
+      <w:r>
+        <w:rPr>
+          <w:rFonts w:ascii="Consolas" w:hAnsi="Consolas"/>
+          <w:sz w:val="19"/>
+        </w:rPr>
+        <w:t xml:space="preserve">        // back to a fresh UserMemory (instead of crashing on startup) if the</w:t>
+      </w:r>
+    </w:p>
+    <w:p>
+      <w:pPr>
+        <w:pStyle w:val="NoSpacing"/>
+        <w:rPr>
+          <w:rFonts w:ascii="Consolas" w:hAnsi="Consolas"/>
+          <w:sz w:val="19"/>
+        </w:rPr>
+      </w:pPr>
+      <w:r>
+        <w:rPr>
+          <w:rFonts w:ascii="Consolas" w:hAnsi="Consolas"/>
+          <w:sz w:val="19"/>
+        </w:rPr>
+        <w:t xml:space="preserve">        // file is empty, contains literal "null", or is otherwise corrupted.</w:t>
+      </w:r>
+    </w:p>
+    <w:p>
+      <w:pPr>
+        <w:pStyle w:val="NoSpacing"/>
+        <w:rPr>
+          <w:rFonts w:ascii="Consolas" w:hAnsi="Consolas"/>
+          <w:sz w:val="19"/>
+        </w:rPr>
+      </w:pPr>
+      <w:r>
+        <w:rPr>
+          <w:rFonts w:ascii="Consolas" w:hAnsi="Consolas"/>
+          <w:sz w:val="19"/>
+        </w:rPr>
+        <w:t xml:space="preserve">        private UserMemory LoadMemory()</w:t>
+      </w:r>
+    </w:p>
+    <w:p>
+      <w:pPr>
+        <w:pStyle w:val="NoSpacing"/>
+        <w:rPr>
+          <w:rFonts w:ascii="Consolas" w:hAnsi="Consolas"/>
+          <w:sz w:val="19"/>
+        </w:rPr>
+      </w:pPr>
+      <w:r>
+        <w:rPr>
+          <w:rFonts w:ascii="Consolas" w:hAnsi="Consolas"/>
+          <w:sz w:val="19"/>
+        </w:rPr>
+        <w:t xml:space="preserve">        {</w:t>
+      </w:r>
+    </w:p>
+    <w:p>
+      <w:pPr>
+        <w:pStyle w:val="NoSpacing"/>
+        <w:rPr>
+          <w:rFonts w:ascii="Consolas" w:hAnsi="Consolas"/>
+          <w:sz w:val="19"/>
+        </w:rPr>
+      </w:pPr>
+      <w:r>
+        <w:rPr>
+          <w:rFonts w:ascii="Consolas" w:hAnsi="Consolas"/>
+          <w:sz w:val="19"/>
+        </w:rPr>
+        <w:t xml:space="preserve">            if (File.Exists(_filePath))</w:t>
+      </w:r>
+    </w:p>
+    <w:p>
+      <w:pPr>
+        <w:pStyle w:val="NoSpacing"/>
+        <w:rPr>
+          <w:rFonts w:ascii="Consolas" w:hAnsi="Consolas"/>
+          <w:sz w:val="19"/>
+        </w:rPr>
+      </w:pPr>
+      <w:r>
+        <w:rPr>
+          <w:rFonts w:ascii="Consolas" w:hAnsi="Consolas"/>
+          <w:sz w:val="19"/>
+        </w:rPr>
+        <w:t xml:space="preserve">            {</w:t>
+      </w:r>
+    </w:p>
+    <w:p>
+      <w:pPr>
+        <w:pStyle w:val="NoSpacing"/>
+        <w:rPr>
+          <w:rFonts w:ascii="Consolas" w:hAnsi="Consolas"/>
+          <w:sz w:val="19"/>
+        </w:rPr>
+      </w:pPr>
+      <w:r>
+        <w:rPr>
+          <w:rFonts w:ascii="Consolas" w:hAnsi="Consolas"/>
+          <w:sz w:val="19"/>
+        </w:rPr>
+        <w:t xml:space="preserve">                try</w:t>
+      </w:r>
+    </w:p>
+    <w:p>
+      <w:pPr>
+        <w:pStyle w:val="NoSpacing"/>
+        <w:rPr>
+          <w:rFonts w:ascii="Consolas" w:hAnsi="Consolas"/>
+          <w:sz w:val="19"/>
+        </w:rPr>
+      </w:pPr>
+      <w:r>
+        <w:rPr>
+          <w:rFonts w:ascii="Consolas" w:hAnsi="Consolas"/>
+          <w:sz w:val="19"/>
+        </w:rPr>
+        <w:t xml:space="preserve">                {</w:t>
+      </w:r>
+    </w:p>
+    <w:p>
+      <w:pPr>
+        <w:pStyle w:val="NoSpacing"/>
+        <w:rPr>
+          <w:rFonts w:ascii="Consolas" w:hAnsi="Consolas"/>
+          <w:sz w:val="19"/>
+        </w:rPr>
+      </w:pPr>
+      <w:r>
+        <w:rPr>
+          <w:rFonts w:ascii="Consolas" w:hAnsi="Consolas"/>
+          <w:sz w:val="19"/>
+        </w:rPr>
+        <w:t xml:space="preserve">                    string json = File.ReadAllText(_filePath);</w:t>
+      </w:r>
+    </w:p>
+    <w:p>
+      <w:pPr>
+        <w:pStyle w:val="NoSpacing"/>
+        <w:rPr>
+          <w:rFonts w:ascii="Consolas" w:hAnsi="Consolas"/>
+          <w:sz w:val="19"/>
+        </w:rPr>
+      </w:pPr>
+      <w:r>
+        <w:rPr>
+          <w:rFonts w:ascii="Consolas" w:hAnsi="Consolas"/>
+          <w:sz w:val="19"/>
+        </w:rPr>
+        <w:t xml:space="preserve">                    return JsonSerializer.Deserialize&lt;UserMemory&gt;(json) ?? new UserMemory();</w:t>
+      </w:r>
+    </w:p>
+    <w:p>
+      <w:pPr>
+        <w:pStyle w:val="NoSpacing"/>
+        <w:rPr>
+          <w:rFonts w:ascii="Consolas" w:hAnsi="Consolas"/>
+          <w:sz w:val="19"/>
+        </w:rPr>
+      </w:pPr>
+      <w:r>
+        <w:rPr>
+          <w:rFonts w:ascii="Consolas" w:hAnsi="Consolas"/>
+          <w:sz w:val="19"/>
+        </w:rPr>
+        <w:t xml:space="preserve">                }</w:t>
+      </w:r>
+    </w:p>
+    <w:p>
+      <w:pPr>
+        <w:pStyle w:val="NoSpacing"/>
+        <w:rPr>
+          <w:rFonts w:ascii="Consolas" w:hAnsi="Consolas"/>
+          <w:sz w:val="19"/>
+        </w:rPr>
+      </w:pPr>
+      <w:r>
+        <w:rPr>
+          <w:rFonts w:ascii="Consolas" w:hAnsi="Consolas"/>
+          <w:sz w:val="19"/>
+        </w:rPr>
+        <w:t xml:space="preserve">                catch (JsonException)</w:t>
+      </w:r>
+    </w:p>
+    <w:p>
+      <w:pPr>
+        <w:pStyle w:val="NoSpacing"/>
+        <w:rPr>
+          <w:rFonts w:ascii="Consolas" w:hAnsi="Consolas"/>
+          <w:sz w:val="19"/>
+        </w:rPr>
+      </w:pPr>
+      <w:r>
+        <w:rPr>
+          <w:rFonts w:ascii="Consolas" w:hAnsi="Consolas"/>
+          <w:sz w:val="19"/>
+        </w:rPr>
+        <w:t xml:space="preserve">                {</w:t>
+      </w:r>
+    </w:p>
+    <w:p>
+      <w:pPr>
+        <w:pStyle w:val="NoSpacing"/>
+        <w:rPr>
+          <w:rFonts w:ascii="Consolas" w:hAnsi="Consolas"/>
+          <w:sz w:val="19"/>
+        </w:rPr>
+      </w:pPr>
+      <w:r>
+        <w:rPr>
+          <w:rFonts w:ascii="Consolas" w:hAnsi="Consolas"/>
+          <w:sz w:val="19"/>
+        </w:rPr>
+        <w:t xml:space="preserve">                    Console.WriteLine($"   [MEMORY MANAGER] Warning: '{_filePath}' is corrupted or unreadable; starting with fresh memory.");</w:t>
+      </w:r>
+    </w:p>
+    <w:p>
+      <w:pPr>
+        <w:pStyle w:val="NoSpacing"/>
+        <w:rPr>
+          <w:rFonts w:ascii="Consolas" w:hAnsi="Consolas"/>
+          <w:sz w:val="19"/>
+        </w:rPr>
+      </w:pPr>
+      <w:r>
+        <w:rPr>
+          <w:rFonts w:ascii="Consolas" w:hAnsi="Consolas"/>
+          <w:sz w:val="19"/>
+        </w:rPr>
+        <w:t xml:space="preserve">                    return new UserMemory();</w:t>
+      </w:r>
+    </w:p>
+    <w:p>
+      <w:pPr>
+        <w:pStyle w:val="NoSpacing"/>
+        <w:rPr>
+          <w:rFonts w:ascii="Consolas" w:hAnsi="Consolas"/>
+          <w:sz w:val="19"/>
+        </w:rPr>
+      </w:pPr>
+      <w:r>
+        <w:rPr>
+          <w:rFonts w:ascii="Consolas" w:hAnsi="Consolas"/>
+          <w:sz w:val="19"/>
+        </w:rPr>
+        <w:t xml:space="preserve">                }</w:t>
+      </w:r>
+    </w:p>
+    <w:p>
+      <w:pPr>
+        <w:pStyle w:val="NoSpacing"/>
+        <w:rPr>
+          <w:rFonts w:ascii="Consolas" w:hAnsi="Consolas"/>
+          <w:sz w:val="19"/>
+        </w:rPr>
+      </w:pPr>
+      <w:r>
+        <w:rPr>
+          <w:rFonts w:ascii="Consolas" w:hAnsi="Consolas"/>
+          <w:sz w:val="19"/>
+        </w:rPr>
+        <w:t xml:space="preserve">            }</w:t>
+      </w:r>
+    </w:p>
+    <w:p>
+      <w:pPr>
+        <w:pStyle w:val="NoSpacing"/>
+        <w:rPr>
+          <w:rFonts w:ascii="Consolas" w:hAnsi="Consolas"/>
+          <w:sz w:val="19"/>
+        </w:rPr>
+      </w:pPr>
+      <w:r>
+        <w:rPr>
+          <w:rFonts w:ascii="Consolas" w:hAnsi="Consolas"/>
+          <w:sz w:val="19"/>
+        </w:rPr>
+        <w:t xml:space="preserve">            return new UserMemory();</w:t>
+      </w:r>
+    </w:p>
+    <w:p>
+      <w:pPr>
+        <w:pStyle w:val="NoSpacing"/>
+        <w:rPr>
+          <w:rFonts w:ascii="Consolas" w:hAnsi="Consolas"/>
+          <w:sz w:val="19"/>
+        </w:rPr>
+      </w:pPr>
       <w:r>
         <w:rPr>
           <w:rFonts w:ascii="Consolas" w:hAnsi="Consolas"/>
           <w:sz w:val="19"/>
         </w:rPr>
         <w:lastRenderedPageBreak/>
-        <w:t xml:space="preserve">        Console.WriteLine($"Loaded {memoryManager.CurrentMemory.Facts.Count} existing facts.");</w:t>
-      </w:r>
-    </w:p>
-    <w:p>
-      <w:pPr>
-        <w:pStyle w:val="NoSpacing"/>
-        <w:rPr>
-          <w:rFonts w:ascii="Consolas" w:hAnsi="Consolas"/>
-          <w:sz w:val="19"/>
-        </w:rPr>
-      </w:pPr>
-      <w:r>
-        <w:rPr>
-          <w:rFonts w:ascii="Consolas" w:hAnsi="Consolas"/>
-          <w:sz w:val="19"/>
-        </w:rPr>
-        <w:t xml:space="preserve">            Console.WriteLine("(Type 'exit' to quit)\n");</w:t>
-      </w:r>
-    </w:p>
-    <w:p>
-      <w:pPr>
-        <w:pStyle w:val="NoSpacing"/>
-        <w:rPr>
-          <w:rFonts w:ascii="Consolas" w:hAnsi="Consolas"/>
-          <w:sz w:val="19"/>
-        </w:rPr>
-      </w:pPr>
-    </w:p>
-    <w:p>
-      <w:pPr>
-        <w:pStyle w:val="NoSpacing"/>
-        <w:rPr>
-          <w:rFonts w:ascii="Consolas" w:hAnsi="Consolas"/>
-          <w:sz w:val="19"/>
-        </w:rPr>
-      </w:pPr>
-      <w:r>
-        <w:rPr>
-          <w:rFonts w:ascii="Consolas" w:hAnsi="Consolas"/>
-          <w:sz w:val="19"/>
-        </w:rPr>
-        <w:t xml:space="preserve">            // 3. The Conversational Loop</w:t>
-      </w:r>
-    </w:p>
-    <w:p>
-      <w:pPr>
-        <w:pStyle w:val="NoSpacing"/>
-        <w:rPr>
-          <w:rFonts w:ascii="Consolas" w:hAnsi="Consolas"/>
-          <w:sz w:val="19"/>
-        </w:rPr>
-      </w:pPr>
-      <w:r>
-        <w:rPr>
-          <w:rFonts w:ascii="Consolas" w:hAnsi="Consolas"/>
-          <w:sz w:val="19"/>
-        </w:rPr>
-        <w:t xml:space="preserve">            while(true)</w:t>
+        <w:t xml:space="preserve">        }</w:t>
+      </w:r>
+    </w:p>
+    <w:p>
+      <w:pPr>
+        <w:pStyle w:val="NoSpacing"/>
+        <w:rPr>
+          <w:rFonts w:ascii="Consolas" w:hAnsi="Consolas"/>
+          <w:sz w:val="19"/>
+        </w:rPr>
+      </w:pPr>
+    </w:p>
+    <w:p>
+      <w:pPr>
+        <w:pStyle w:val="NoSpacing"/>
+        <w:rPr>
+          <w:rFonts w:ascii="Consolas" w:hAnsi="Consolas"/>
+          <w:sz w:val="19"/>
+        </w:rPr>
+      </w:pPr>
+      <w:r>
+        <w:rPr>
+          <w:rFonts w:ascii="Consolas" w:hAnsi="Consolas"/>
+          <w:sz w:val="19"/>
+        </w:rPr>
+        <w:t xml:space="preserve">        /// &lt;summary&gt;</w:t>
+      </w:r>
+    </w:p>
+    <w:p>
+      <w:pPr>
+        <w:pStyle w:val="NoSpacing"/>
+        <w:rPr>
+          <w:rFonts w:ascii="Consolas" w:hAnsi="Consolas"/>
+          <w:sz w:val="19"/>
+        </w:rPr>
+      </w:pPr>
+      <w:r>
+        <w:rPr>
+          <w:rFonts w:ascii="Consolas" w:hAnsi="Consolas"/>
+          <w:sz w:val="19"/>
+        </w:rPr>
+        <w:t xml:space="preserve">        /// Analyzes the user input in the background to determin if a new fact should be saved</w:t>
+      </w:r>
+    </w:p>
+    <w:p>
+      <w:pPr>
+        <w:pStyle w:val="NoSpacing"/>
+        <w:rPr>
+          <w:rFonts w:ascii="Consolas" w:hAnsi="Consolas"/>
+          <w:sz w:val="19"/>
+        </w:rPr>
+      </w:pPr>
+      <w:r>
+        <w:rPr>
+          <w:rFonts w:ascii="Consolas" w:hAnsi="Consolas"/>
+          <w:sz w:val="19"/>
+        </w:rPr>
+        <w:t xml:space="preserve">        /// &lt;/summary&gt;</w:t>
+      </w:r>
+    </w:p>
+    <w:p>
+      <w:pPr>
+        <w:pStyle w:val="NoSpacing"/>
+        <w:rPr>
+          <w:rFonts w:ascii="Consolas" w:hAnsi="Consolas"/>
+          <w:sz w:val="19"/>
+        </w:rPr>
+      </w:pPr>
+      <w:r>
+        <w:rPr>
+          <w:rFonts w:ascii="Consolas" w:hAnsi="Consolas"/>
+          <w:sz w:val="19"/>
+        </w:rPr>
+        <w:t xml:space="preserve">        public async Task ExtractAndSaveFactAsync(string userInput)</w:t>
+      </w:r>
+    </w:p>
+    <w:p>
+      <w:pPr>
+        <w:pStyle w:val="NoSpacing"/>
+        <w:rPr>
+          <w:rFonts w:ascii="Consolas" w:hAnsi="Consolas"/>
+          <w:sz w:val="19"/>
+        </w:rPr>
+      </w:pPr>
+      <w:r>
+        <w:rPr>
+          <w:rFonts w:ascii="Consolas" w:hAnsi="Consolas"/>
+          <w:sz w:val="19"/>
+        </w:rPr>
+        <w:t xml:space="preserve">        {</w:t>
+      </w:r>
+    </w:p>
+    <w:p>
+      <w:pPr>
+        <w:pStyle w:val="NoSpacing"/>
+        <w:rPr>
+          <w:rFonts w:ascii="Consolas" w:hAnsi="Consolas"/>
+          <w:sz w:val="19"/>
+        </w:rPr>
+      </w:pPr>
+      <w:r>
+        <w:rPr>
+          <w:rFonts w:ascii="Consolas" w:hAnsi="Consolas"/>
+          <w:sz w:val="19"/>
+        </w:rPr>
+        <w:t xml:space="preserve">            // Prompt engineered specifcally for data extraction, ignoring conversational filler.</w:t>
+      </w:r>
+    </w:p>
+    <w:p>
+      <w:pPr>
+        <w:pStyle w:val="NoSpacing"/>
+        <w:rPr>
+          <w:rFonts w:ascii="Consolas" w:hAnsi="Consolas"/>
+          <w:sz w:val="19"/>
+        </w:rPr>
+      </w:pPr>
+      <w:r>
+        <w:rPr>
+          <w:rFonts w:ascii="Consolas" w:hAnsi="Consolas"/>
+          <w:sz w:val="19"/>
+        </w:rPr>
+        <w:t xml:space="preserve">            // The extraction rules are the system message; the actual text to analyze must be</w:t>
+      </w:r>
+    </w:p>
+    <w:p>
+      <w:pPr>
+        <w:pStyle w:val="NoSpacing"/>
+        <w:rPr>
+          <w:rFonts w:ascii="Consolas" w:hAnsi="Consolas"/>
+          <w:sz w:val="19"/>
+        </w:rPr>
+      </w:pPr>
+      <w:r>
+        <w:rPr>
+          <w:rFonts w:ascii="Consolas" w:hAnsi="Consolas"/>
+          <w:sz w:val="19"/>
+        </w:rPr>
+        <w:t xml:space="preserve">            // a separate user message - a ChatHistory containing only a system message is</w:t>
+      </w:r>
+    </w:p>
+    <w:p>
+      <w:pPr>
+        <w:pStyle w:val="NoSpacing"/>
+        <w:rPr>
+          <w:rFonts w:ascii="Consolas" w:hAnsi="Consolas"/>
+          <w:sz w:val="19"/>
+        </w:rPr>
+      </w:pPr>
+      <w:r>
+        <w:rPr>
+          <w:rFonts w:ascii="Consolas" w:hAnsi="Consolas"/>
+          <w:sz w:val="19"/>
+        </w:rPr>
+        <w:t xml:space="preserve">            // rejected by Gemini ("Chat history can't contain only system messages").</w:t>
+      </w:r>
+    </w:p>
+    <w:p>
+      <w:pPr>
+        <w:pStyle w:val="NoSpacing"/>
+        <w:rPr>
+          <w:rFonts w:ascii="Consolas" w:hAnsi="Consolas"/>
+          <w:sz w:val="19"/>
+        </w:rPr>
+      </w:pPr>
+      <w:r>
+        <w:rPr>
+          <w:rFonts w:ascii="Consolas" w:hAnsi="Consolas"/>
+          <w:sz w:val="19"/>
+        </w:rPr>
+        <w:t xml:space="preserve">            string systemPrompt = @"</w:t>
+      </w:r>
+    </w:p>
+    <w:p>
+      <w:pPr>
+        <w:pStyle w:val="NoSpacing"/>
+        <w:rPr>
+          <w:rFonts w:ascii="Consolas" w:hAnsi="Consolas"/>
+          <w:sz w:val="19"/>
+        </w:rPr>
+      </w:pPr>
+      <w:r>
+        <w:rPr>
+          <w:rFonts w:ascii="Consolas" w:hAnsi="Consolas"/>
+          <w:sz w:val="19"/>
+        </w:rPr>
+        <w:t xml:space="preserve">                Analyze the user's input.  If they state a permanent fact about themselves</w:t>
+      </w:r>
+    </w:p>
+    <w:p>
+      <w:pPr>
+        <w:pStyle w:val="NoSpacing"/>
+        <w:rPr>
+          <w:rFonts w:ascii="Consolas" w:hAnsi="Consolas"/>
+          <w:sz w:val="19"/>
+        </w:rPr>
+      </w:pPr>
+      <w:r>
+        <w:rPr>
+          <w:rFonts w:ascii="Consolas" w:hAnsi="Consolas"/>
+          <w:sz w:val="19"/>
+        </w:rPr>
+        <w:t xml:space="preserve">                (e.g. their name, preferences, job, family), extract it as a short sentence.</w:t>
+      </w:r>
+    </w:p>
+    <w:p>
+      <w:pPr>
+        <w:pStyle w:val="NoSpacing"/>
+        <w:rPr>
+          <w:rFonts w:ascii="Consolas" w:hAnsi="Consolas"/>
+          <w:sz w:val="19"/>
+        </w:rPr>
+      </w:pPr>
+      <w:r>
+        <w:rPr>
+          <w:rFonts w:ascii="Consolas" w:hAnsi="Consolas"/>
+          <w:sz w:val="19"/>
+        </w:rPr>
+        <w:t xml:space="preserve">                If there are no new personal facts, output exactly 'NONE'.</w:t>
+      </w:r>
+    </w:p>
+    <w:p>
+      <w:pPr>
+        <w:pStyle w:val="NoSpacing"/>
+        <w:rPr>
+          <w:rFonts w:ascii="Consolas" w:hAnsi="Consolas"/>
+          <w:sz w:val="19"/>
+        </w:rPr>
+      </w:pPr>
+      <w:r>
+        <w:rPr>
+          <w:rFonts w:ascii="Consolas" w:hAnsi="Consolas"/>
+          <w:sz w:val="19"/>
+        </w:rPr>
+        <w:t xml:space="preserve">            ";</w:t>
+      </w:r>
+    </w:p>
+    <w:p>
+      <w:pPr>
+        <w:pStyle w:val="NoSpacing"/>
+        <w:rPr>
+          <w:rFonts w:ascii="Consolas" w:hAnsi="Consolas"/>
+          <w:sz w:val="19"/>
+        </w:rPr>
+      </w:pPr>
+    </w:p>
+    <w:p>
+      <w:pPr>
+        <w:pStyle w:val="NoSpacing"/>
+        <w:rPr>
+          <w:rFonts w:ascii="Consolas" w:hAnsi="Consolas"/>
+          <w:sz w:val="19"/>
+        </w:rPr>
+      </w:pPr>
+      <w:r>
+        <w:rPr>
+          <w:rFonts w:ascii="Consolas" w:hAnsi="Consolas"/>
+          <w:sz w:val="19"/>
+        </w:rPr>
+        <w:t xml:space="preserve">            var history = new ChatHistory(systemPrompt);</w:t>
+      </w:r>
+    </w:p>
+    <w:p>
+      <w:pPr>
+        <w:pStyle w:val="NoSpacing"/>
+        <w:rPr>
+          <w:rFonts w:ascii="Consolas" w:hAnsi="Consolas"/>
+          <w:sz w:val="19"/>
+        </w:rPr>
+      </w:pPr>
+      <w:r>
+        <w:rPr>
+          <w:rFonts w:ascii="Consolas" w:hAnsi="Consolas"/>
+          <w:sz w:val="19"/>
+        </w:rPr>
+        <w:t xml:space="preserve">            history.AddUserMessage(userInput);</w:t>
+      </w:r>
+    </w:p>
+    <w:p>
+      <w:pPr>
+        <w:pStyle w:val="NoSpacing"/>
+        <w:rPr>
+          <w:rFonts w:ascii="Consolas" w:hAnsi="Consolas"/>
+          <w:sz w:val="19"/>
+        </w:rPr>
+      </w:pPr>
+      <w:r>
+        <w:rPr>
+          <w:rFonts w:ascii="Consolas" w:hAnsi="Consolas"/>
+          <w:sz w:val="19"/>
+        </w:rPr>
+        <w:t xml:space="preserve">            var response = await _chatService.GetChatMessageContentAsync(history);</w:t>
+      </w:r>
+    </w:p>
+    <w:p>
+      <w:pPr>
+        <w:pStyle w:val="NoSpacing"/>
+        <w:rPr>
+          <w:rFonts w:ascii="Consolas" w:hAnsi="Consolas"/>
+          <w:sz w:val="19"/>
+        </w:rPr>
+      </w:pPr>
+      <w:r>
+        <w:rPr>
+          <w:rFonts w:ascii="Consolas" w:hAnsi="Consolas"/>
+          <w:sz w:val="19"/>
+        </w:rPr>
+        <w:t xml:space="preserve">            string fact = response.Content?.Trim() ?? "NONE";</w:t>
+      </w:r>
+    </w:p>
+    <w:p>
+      <w:pPr>
+        <w:pStyle w:val="NoSpacing"/>
+        <w:rPr>
+          <w:rFonts w:ascii="Consolas" w:hAnsi="Consolas"/>
+          <w:sz w:val="19"/>
+        </w:rPr>
+      </w:pPr>
+    </w:p>
+    <w:p>
+      <w:pPr>
+        <w:pStyle w:val="NoSpacing"/>
+        <w:rPr>
+          <w:rFonts w:ascii="Consolas" w:hAnsi="Consolas"/>
+          <w:sz w:val="19"/>
+        </w:rPr>
+      </w:pPr>
+      <w:r>
+        <w:rPr>
+          <w:rFonts w:ascii="Consolas" w:hAnsi="Consolas"/>
+          <w:sz w:val="19"/>
+        </w:rPr>
+        <w:t xml:space="preserve">            // Only update the file if a valid fact was found</w:t>
+      </w:r>
+    </w:p>
+    <w:p>
+      <w:pPr>
+        <w:pStyle w:val="NoSpacing"/>
+        <w:rPr>
+          <w:rFonts w:ascii="Consolas" w:hAnsi="Consolas"/>
+          <w:sz w:val="19"/>
+        </w:rPr>
+      </w:pPr>
+      <w:r>
+        <w:rPr>
+          <w:rFonts w:ascii="Consolas" w:hAnsi="Consolas"/>
+          <w:sz w:val="19"/>
+        </w:rPr>
+        <w:t xml:space="preserve">            if (!fact.Equals("NONE", StringComparison.OrdinalIgnoreCase))</w:t>
       </w:r>
     </w:p>
     <w:p>
@@ -894,201 +2573,39 @@
           <w:rFonts w:ascii="Consolas" w:hAnsi="Consolas"/>
           <w:sz w:val="19"/>
         </w:rPr>
-        <w:t xml:space="preserve">                Console.Write("User: ");</w:t>
-      </w:r>
-    </w:p>
-    <w:p>
-      <w:pPr>
-        <w:pStyle w:val="NoSpacing"/>
-        <w:rPr>
-          <w:rFonts w:ascii="Consolas" w:hAnsi="Consolas"/>
-          <w:sz w:val="19"/>
-        </w:rPr>
-      </w:pPr>
-      <w:r>
-        <w:rPr>
-          <w:rFonts w:ascii="Consolas" w:hAnsi="Consolas"/>
-          <w:sz w:val="19"/>
-        </w:rPr>
-        <w:t xml:space="preserve">                string? input = Console.ReadLine();</w:t>
-      </w:r>
-    </w:p>
-    <w:p>
-      <w:pPr>
-        <w:pStyle w:val="NoSpacing"/>
-        <w:rPr>
-          <w:rFonts w:ascii="Consolas" w:hAnsi="Consolas"/>
-          <w:sz w:val="19"/>
-        </w:rPr>
-      </w:pPr>
-      <w:r>
-        <w:rPr>
-          <w:rFonts w:ascii="Consolas" w:hAnsi="Consolas"/>
-          <w:sz w:val="19"/>
-        </w:rPr>
-        <w:t xml:space="preserve">                if (string.IsNullOrWhiteSpace(input)) continue;</w:t>
-      </w:r>
-    </w:p>
-    <w:p>
-      <w:pPr>
-        <w:pStyle w:val="NoSpacing"/>
-        <w:rPr>
-          <w:rFonts w:ascii="Consolas" w:hAnsi="Consolas"/>
-          <w:sz w:val="19"/>
-        </w:rPr>
-      </w:pPr>
-      <w:r>
-        <w:rPr>
-          <w:rFonts w:ascii="Consolas" w:hAnsi="Consolas"/>
-          <w:sz w:val="19"/>
-        </w:rPr>
-        <w:t xml:space="preserve">                if (input.Equals("exit", StringComparison.OrdinalIgnoreCase)) break;</w:t>
-      </w:r>
-    </w:p>
-    <w:p>
-      <w:pPr>
-        <w:pStyle w:val="NoSpacing"/>
-        <w:rPr>
-          <w:rFonts w:ascii="Consolas" w:hAnsi="Consolas"/>
-          <w:sz w:val="19"/>
-        </w:rPr>
-      </w:pPr>
-    </w:p>
-    <w:p>
-      <w:pPr>
-        <w:pStyle w:val="NoSpacing"/>
-        <w:rPr>
-          <w:rFonts w:ascii="Consolas" w:hAnsi="Consolas"/>
-          <w:sz w:val="19"/>
-        </w:rPr>
-      </w:pPr>
-      <w:r>
-        <w:rPr>
-          <w:rFonts w:ascii="Consolas" w:hAnsi="Consolas"/>
-          <w:sz w:val="19"/>
-        </w:rPr>
-        <w:t xml:space="preserve">                // Step A: The Agent responds using the currently loaded memory</w:t>
-      </w:r>
-    </w:p>
-    <w:p>
-      <w:pPr>
-        <w:pStyle w:val="NoSpacing"/>
-        <w:rPr>
-          <w:rFonts w:ascii="Consolas" w:hAnsi="Consolas"/>
-          <w:sz w:val="19"/>
-        </w:rPr>
-      </w:pPr>
-      <w:r>
-        <w:rPr>
-          <w:rFonts w:ascii="Consolas" w:hAnsi="Consolas"/>
-          <w:sz w:val="19"/>
-        </w:rPr>
-        <w:t xml:space="preserve">                string response = await memoryAgent.ChatAsync(input, memoryManager.CurrentMemory);</w:t>
-      </w:r>
-    </w:p>
-    <w:p>
-      <w:pPr>
-        <w:pStyle w:val="NoSpacing"/>
-        <w:rPr>
-          <w:rFonts w:ascii="Consolas" w:hAnsi="Consolas"/>
-          <w:sz w:val="19"/>
-        </w:rPr>
-      </w:pPr>
-      <w:r>
-        <w:rPr>
-          <w:rFonts w:ascii="Consolas" w:hAnsi="Consolas"/>
-          <w:sz w:val="19"/>
-        </w:rPr>
-        <w:t xml:space="preserve">                Console.WriteLine($"\nAI {response}");</w:t>
-      </w:r>
-    </w:p>
-    <w:p>
-      <w:pPr>
-        <w:pStyle w:val="NoSpacing"/>
-        <w:rPr>
-          <w:rFonts w:ascii="Consolas" w:hAnsi="Consolas"/>
-          <w:sz w:val="19"/>
-        </w:rPr>
-      </w:pPr>
-    </w:p>
-    <w:p>
-      <w:pPr>
-        <w:pStyle w:val="NoSpacing"/>
-        <w:rPr>
-          <w:rFonts w:ascii="Consolas" w:hAnsi="Consolas"/>
-          <w:sz w:val="19"/>
-        </w:rPr>
-      </w:pPr>
-      <w:r>
-        <w:rPr>
-          <w:rFonts w:ascii="Consolas" w:hAnsi="Consolas"/>
-          <w:sz w:val="19"/>
-        </w:rPr>
-        <w:t xml:space="preserve">                // Step B: Fire-and-forget extraction in the background</w:t>
-      </w:r>
-    </w:p>
-    <w:p>
-      <w:pPr>
-        <w:pStyle w:val="NoSpacing"/>
-        <w:rPr>
-          <w:rFonts w:ascii="Consolas" w:hAnsi="Consolas"/>
-          <w:sz w:val="19"/>
-        </w:rPr>
-      </w:pPr>
-      <w:r>
-        <w:rPr>
-          <w:rFonts w:ascii="Consolas" w:hAnsi="Consolas"/>
-          <w:sz w:val="19"/>
-        </w:rPr>
-        <w:t xml:space="preserve">                // We use await here to ensure it finishes before the next loop,</w:t>
-      </w:r>
-    </w:p>
-    <w:p>
-      <w:pPr>
-        <w:pStyle w:val="NoSpacing"/>
-        <w:rPr>
-          <w:rFonts w:ascii="Consolas" w:hAnsi="Consolas"/>
-          <w:sz w:val="19"/>
-        </w:rPr>
-      </w:pPr>
-      <w:r>
-        <w:rPr>
-          <w:rFonts w:ascii="Consolas" w:hAnsi="Consolas"/>
-          <w:sz w:val="19"/>
-        </w:rPr>
-        <w:t xml:space="preserve">                // but structurally this operates as a background processor.</w:t>
-      </w:r>
-    </w:p>
-    <w:p>
-      <w:pPr>
-        <w:pStyle w:val="NoSpacing"/>
-        <w:rPr>
-          <w:rFonts w:ascii="Consolas" w:hAnsi="Consolas"/>
-          <w:sz w:val="19"/>
-        </w:rPr>
-      </w:pPr>
-      <w:r>
-        <w:rPr>
-          <w:rFonts w:ascii="Consolas" w:hAnsi="Consolas"/>
-          <w:sz w:val="19"/>
-        </w:rPr>
-        <w:t xml:space="preserve">                await memoryManager.ExtractAndSaveFactAsync(input);</w:t>
-      </w:r>
-    </w:p>
-    <w:p>
-      <w:pPr>
-        <w:pStyle w:val="NoSpacing"/>
-        <w:rPr>
-          <w:rFonts w:ascii="Consolas" w:hAnsi="Consolas"/>
-          <w:sz w:val="19"/>
-        </w:rPr>
-      </w:pPr>
-      <w:r>
-        <w:rPr>
-          <w:rFonts w:ascii="Consolas" w:hAnsi="Consolas"/>
-          <w:sz w:val="19"/>
-        </w:rPr>
-        <w:t xml:space="preserve">                Console.WriteLine();</w:t>
+        <w:t xml:space="preserve">                CurrentMemory.Facts.Add(fact);</w:t>
+      </w:r>
+    </w:p>
+    <w:p>
+      <w:pPr>
+        <w:pStyle w:val="NoSpacing"/>
+        <w:rPr>
+          <w:rFonts w:ascii="Consolas" w:hAnsi="Consolas"/>
+          <w:sz w:val="19"/>
+        </w:rPr>
+      </w:pPr>
+      <w:r>
+        <w:rPr>
+          <w:rFonts w:ascii="Consolas" w:hAnsi="Consolas"/>
+          <w:sz w:val="19"/>
+        </w:rPr>
+        <w:t xml:space="preserve">                SaveMemory();</w:t>
+      </w:r>
+    </w:p>
+    <w:p>
+      <w:pPr>
+        <w:pStyle w:val="NoSpacing"/>
+        <w:rPr>
+          <w:rFonts w:ascii="Consolas" w:hAnsi="Consolas"/>
+          <w:sz w:val="19"/>
+        </w:rPr>
+      </w:pPr>
+      <w:r>
+        <w:rPr>
+          <w:rFonts w:ascii="Consolas" w:hAnsi="Consolas"/>
+          <w:sz w:val="19"/>
+        </w:rPr>
+        <w:t xml:space="preserve">                Console.WriteLine($"\n   [MEMORY MANAGER] New fact saved: {fact}");</w:t>
       </w:r>
     </w:p>
     <w:p>
@@ -1131,6 +2648,127 @@
           <w:sz w:val="19"/>
         </w:rPr>
       </w:pPr>
+    </w:p>
+    <w:p>
+      <w:pPr>
+        <w:pStyle w:val="NoSpacing"/>
+        <w:rPr>
+          <w:rFonts w:ascii="Consolas" w:hAnsi="Consolas"/>
+          <w:sz w:val="19"/>
+        </w:rPr>
+      </w:pPr>
+      <w:r>
+        <w:rPr>
+          <w:rFonts w:ascii="Consolas" w:hAnsi="Consolas"/>
+          <w:sz w:val="19"/>
+        </w:rPr>
+        <w:t xml:space="preserve">        // Persists the current in-memory fact list back to the JSON file,</w:t>
+      </w:r>
+    </w:p>
+    <w:p>
+      <w:pPr>
+        <w:pStyle w:val="NoSpacing"/>
+        <w:rPr>
+          <w:rFonts w:ascii="Consolas" w:hAnsi="Consolas"/>
+          <w:sz w:val="19"/>
+        </w:rPr>
+      </w:pPr>
+      <w:r>
+        <w:rPr>
+          <w:rFonts w:ascii="Consolas" w:hAnsi="Consolas"/>
+          <w:sz w:val="19"/>
+        </w:rPr>
+        <w:t xml:space="preserve">        // overwriting it entirely each time.</w:t>
+      </w:r>
+    </w:p>
+    <w:p>
+      <w:pPr>
+        <w:pStyle w:val="NoSpacing"/>
+        <w:rPr>
+          <w:rFonts w:ascii="Consolas" w:hAnsi="Consolas"/>
+          <w:sz w:val="19"/>
+        </w:rPr>
+      </w:pPr>
+      <w:r>
+        <w:rPr>
+          <w:rFonts w:ascii="Consolas" w:hAnsi="Consolas"/>
+          <w:sz w:val="19"/>
+        </w:rPr>
+        <w:t xml:space="preserve">        private void SaveMemory()</w:t>
+      </w:r>
+    </w:p>
+    <w:p>
+      <w:pPr>
+        <w:pStyle w:val="NoSpacing"/>
+        <w:rPr>
+          <w:rFonts w:ascii="Consolas" w:hAnsi="Consolas"/>
+          <w:sz w:val="19"/>
+        </w:rPr>
+      </w:pPr>
+      <w:r>
+        <w:rPr>
+          <w:rFonts w:ascii="Consolas" w:hAnsi="Consolas"/>
+          <w:sz w:val="19"/>
+        </w:rPr>
+        <w:t xml:space="preserve">        {</w:t>
+      </w:r>
+    </w:p>
+    <w:p>
+      <w:pPr>
+        <w:pStyle w:val="NoSpacing"/>
+        <w:rPr>
+          <w:rFonts w:ascii="Consolas" w:hAnsi="Consolas"/>
+          <w:sz w:val="19"/>
+        </w:rPr>
+      </w:pPr>
+      <w:r>
+        <w:rPr>
+          <w:rFonts w:ascii="Consolas" w:hAnsi="Consolas"/>
+          <w:sz w:val="19"/>
+        </w:rPr>
+        <w:t xml:space="preserve">            string json = JsonSerializer.Serialize(CurrentMemory, new JsonSerializerOptions { WriteIndented = true });</w:t>
+      </w:r>
+    </w:p>
+    <w:p>
+      <w:pPr>
+        <w:pStyle w:val="NoSpacing"/>
+        <w:rPr>
+          <w:rFonts w:ascii="Consolas" w:hAnsi="Consolas"/>
+          <w:sz w:val="19"/>
+        </w:rPr>
+      </w:pPr>
+      <w:r>
+        <w:rPr>
+          <w:rFonts w:ascii="Consolas" w:hAnsi="Consolas"/>
+          <w:sz w:val="19"/>
+        </w:rPr>
+        <w:t xml:space="preserve">            File.WriteAllText(_filePath, json);</w:t>
+      </w:r>
+    </w:p>
+    <w:p>
+      <w:pPr>
+        <w:pStyle w:val="NoSpacing"/>
+        <w:rPr>
+          <w:rFonts w:ascii="Consolas" w:hAnsi="Consolas"/>
+          <w:sz w:val="19"/>
+        </w:rPr>
+      </w:pPr>
+      <w:r>
+        <w:rPr>
+          <w:rFonts w:ascii="Consolas" w:hAnsi="Consolas"/>
+          <w:sz w:val="19"/>
+        </w:rPr>
+        <w:t xml:space="preserve">        }</w:t>
+      </w:r>
+    </w:p>
+    <w:p>
+      <w:pPr>
+        <w:pStyle w:val="NoSpacing"/>
+        <w:rPr>
+          <w:rFonts w:ascii="Consolas" w:hAnsi="Consolas"/>
+          <w:sz w:val="19"/>
+        </w:rPr>
+      </w:pPr>
       <w:r>
         <w:rPr>
           <w:rFonts w:ascii="Consolas" w:hAnsi="Consolas"/>
@@ -1165,87 +2803,23 @@
         <w:rPr>
           <w:b/>
         </w:rPr>
-        <w:t>UserMemory.cs</w:t>
-      </w:r>
-    </w:p>
-    <w:p>
-      <w:pPr>
-        <w:pStyle w:val="NoSpacing"/>
-        <w:rPr>
-          <w:rFonts w:ascii="Consolas" w:hAnsi="Consolas"/>
-          <w:sz w:val="19"/>
-        </w:rPr>
-      </w:pPr>
-      <w:r>
-        <w:rPr>
-          <w:rFonts w:ascii="Consolas" w:hAnsi="Consolas"/>
-          <w:sz w:val="19"/>
-        </w:rPr>
-        <w:t>// UserMemory</w:t>
-      </w:r>
-    </w:p>
-    <w:p>
-      <w:pPr>
-        <w:pStyle w:val="NoSpacing"/>
-        <w:rPr>
-          <w:rFonts w:ascii="Consolas" w:hAnsi="Consolas"/>
-          <w:sz w:val="19"/>
-        </w:rPr>
-      </w:pPr>
-      <w:r>
-        <w:rPr>
-          <w:rFonts w:ascii="Consolas" w:hAnsi="Consolas"/>
-          <w:sz w:val="19"/>
-        </w:rPr>
-        <w:t>// ---------------------------------------------------------------------------</w:t>
-      </w:r>
-    </w:p>
-    <w:p>
-      <w:pPr>
-        <w:pStyle w:val="NoSpacing"/>
-        <w:rPr>
-          <w:rFonts w:ascii="Consolas" w:hAnsi="Consolas"/>
-          <w:sz w:val="19"/>
-        </w:rPr>
-      </w:pPr>
-      <w:r>
-        <w:rPr>
-          <w:rFonts w:ascii="Consolas" w:hAnsi="Consolas"/>
-          <w:sz w:val="19"/>
-        </w:rPr>
-        <w:t>// The on-disk shape of an agent's long-term memory - a flat list of short</w:t>
-      </w:r>
-    </w:p>
-    <w:p>
-      <w:pPr>
-        <w:pStyle w:val="NoSpacing"/>
-        <w:rPr>
-          <w:rFonts w:ascii="Consolas" w:hAnsi="Consolas"/>
-          <w:sz w:val="19"/>
-        </w:rPr>
-      </w:pPr>
-      <w:r>
-        <w:rPr>
-          <w:rFonts w:ascii="Consolas" w:hAnsi="Consolas"/>
-          <w:sz w:val="19"/>
-        </w:rPr>
-        <w:t>// facts, serialized to/from user_memory.json by MemoryManager.</w:t>
-      </w:r>
-    </w:p>
-    <w:p>
-      <w:pPr>
-        <w:pStyle w:val="NoSpacing"/>
-        <w:rPr>
-          <w:rFonts w:ascii="Consolas" w:hAnsi="Consolas"/>
-          <w:sz w:val="19"/>
-        </w:rPr>
-      </w:pPr>
-      <w:r>
-        <w:rPr>
-          <w:rFonts w:ascii="Consolas" w:hAnsi="Consolas"/>
-          <w:sz w:val="19"/>
-        </w:rPr>
-        <w:t>using System.Text.Json.Serialization;</w:t>
+        <w:t>MemoryAgent.cs</w:t>
+      </w:r>
+    </w:p>
+    <w:p>
+      <w:pPr>
+        <w:pStyle w:val="NoSpacing"/>
+        <w:rPr>
+          <w:rFonts w:ascii="Consolas" w:hAnsi="Consolas"/>
+          <w:sz w:val="19"/>
+        </w:rPr>
+      </w:pPr>
+      <w:r>
+        <w:rPr>
+          <w:rFonts w:ascii="Consolas" w:hAnsi="Consolas"/>
+          <w:sz w:val="19"/>
+        </w:rPr>
+        <w:t>using Microsoft.SemanticKernel.ChatCompletion;</w:t>
       </w:r>
     </w:p>
     <w:p>
@@ -1302,7 +2876,7 @@
           <w:rFonts w:ascii="Consolas" w:hAnsi="Consolas"/>
           <w:sz w:val="19"/>
         </w:rPr>
-        <w:t xml:space="preserve">    internal class UserMemory</w:t>
+        <w:t xml:space="preserve">    internal class MemoryAgent</w:t>
       </w:r>
     </w:p>
     <w:p>
@@ -1334,396 +2908,6 @@
           <w:rFonts w:ascii="Consolas" w:hAnsi="Consolas"/>
           <w:sz w:val="19"/>
         </w:rPr>
-        <w:t xml:space="preserve">        /// &lt;summary&gt;</w:t>
-      </w:r>
-    </w:p>
-    <w:p>
-      <w:pPr>
-        <w:pStyle w:val="NoSpacing"/>
-        <w:rPr>
-          <w:rFonts w:ascii="Consolas" w:hAnsi="Consolas"/>
-          <w:sz w:val="19"/>
-        </w:rPr>
-      </w:pPr>
-      <w:r>
-        <w:rPr>
-          <w:rFonts w:ascii="Consolas" w:hAnsi="Consolas"/>
-          <w:sz w:val="19"/>
-        </w:rPr>
-        <w:t xml:space="preserve">        /// The data structure representing the agetn's long-term storage.</w:t>
-      </w:r>
-    </w:p>
-    <w:p>
-      <w:pPr>
-        <w:pStyle w:val="NoSpacing"/>
-        <w:rPr>
-          <w:rFonts w:ascii="Consolas" w:hAnsi="Consolas"/>
-          <w:sz w:val="19"/>
-        </w:rPr>
-      </w:pPr>
-      <w:r>
-        <w:rPr>
-          <w:rFonts w:ascii="Consolas" w:hAnsi="Consolas"/>
-          <w:sz w:val="19"/>
-        </w:rPr>
-        <w:t xml:space="preserve">        /// &lt;/summary&gt;</w:t>
-      </w:r>
-    </w:p>
-    <w:p>
-      <w:pPr>
-        <w:pStyle w:val="NoSpacing"/>
-        <w:rPr>
-          <w:rFonts w:ascii="Consolas" w:hAnsi="Consolas"/>
-          <w:sz w:val="19"/>
-        </w:rPr>
-      </w:pPr>
-      <w:r>
-        <w:rPr>
-          <w:rFonts w:ascii="Consolas" w:hAnsi="Consolas"/>
-          <w:sz w:val="19"/>
-        </w:rPr>
-        <w:t xml:space="preserve">        [JsonPropertyName("facts")]</w:t>
-      </w:r>
-    </w:p>
-    <w:p>
-      <w:pPr>
-        <w:pStyle w:val="NoSpacing"/>
-        <w:rPr>
-          <w:rFonts w:ascii="Consolas" w:hAnsi="Consolas"/>
-          <w:sz w:val="19"/>
-        </w:rPr>
-      </w:pPr>
-      <w:r>
-        <w:rPr>
-          <w:rFonts w:ascii="Consolas" w:hAnsi="Consolas"/>
-          <w:sz w:val="19"/>
-        </w:rPr>
-        <w:t xml:space="preserve">        public List&lt;string&gt; Facts { get; set; } = new List&lt;string&gt;();</w:t>
-      </w:r>
-    </w:p>
-    <w:p>
-      <w:pPr>
-        <w:pStyle w:val="NoSpacing"/>
-        <w:rPr>
-          <w:rFonts w:ascii="Consolas" w:hAnsi="Consolas"/>
-          <w:sz w:val="19"/>
-        </w:rPr>
-      </w:pPr>
-      <w:r>
-        <w:rPr>
-          <w:rFonts w:ascii="Consolas" w:hAnsi="Consolas"/>
-          <w:sz w:val="19"/>
-        </w:rPr>
-        <w:t xml:space="preserve">    }</w:t>
-      </w:r>
-    </w:p>
-    <w:p>
-      <w:pPr>
-        <w:pStyle w:val="NoSpacing"/>
-        <w:rPr>
-          <w:rFonts w:ascii="Consolas" w:hAnsi="Consolas"/>
-          <w:sz w:val="19"/>
-        </w:rPr>
-      </w:pPr>
-      <w:r>
-        <w:rPr>
-          <w:rFonts w:ascii="Consolas" w:hAnsi="Consolas"/>
-          <w:sz w:val="19"/>
-        </w:rPr>
-        <w:t>}</w:t>
-      </w:r>
-    </w:p>
-    <w:p>
-      <w:pPr>
-        <w:rPr>
-          <w:b/>
-        </w:rPr>
-      </w:pPr>
-      <w:r>
-        <w:rPr>
-          <w:b/>
-        </w:rPr>
-        <w:t>MemoryManager.cs</w:t>
-      </w:r>
-    </w:p>
-    <w:p>
-      <w:pPr>
-        <w:pStyle w:val="NoSpacing"/>
-        <w:rPr>
-          <w:rFonts w:ascii="Consolas" w:hAnsi="Consolas"/>
-          <w:sz w:val="19"/>
-        </w:rPr>
-      </w:pPr>
-      <w:r>
-        <w:rPr>
-          <w:rFonts w:ascii="Consolas" w:hAnsi="Consolas"/>
-          <w:sz w:val="19"/>
-        </w:rPr>
-        <w:t>// MemoryManager</w:t>
-      </w:r>
-    </w:p>
-    <w:p>
-      <w:pPr>
-        <w:pStyle w:val="NoSpacing"/>
-        <w:rPr>
-          <w:rFonts w:ascii="Consolas" w:hAnsi="Consolas"/>
-          <w:sz w:val="19"/>
-        </w:rPr>
-      </w:pPr>
-      <w:r>
-        <w:rPr>
-          <w:rFonts w:ascii="Consolas" w:hAnsi="Consolas"/>
-          <w:sz w:val="19"/>
-        </w:rPr>
-        <w:t>// ---------------------------------------------------------------------------</w:t>
-      </w:r>
-    </w:p>
-    <w:p>
-      <w:pPr>
-        <w:pStyle w:val="NoSpacing"/>
-        <w:rPr>
-          <w:rFonts w:ascii="Consolas" w:hAnsi="Consolas"/>
-          <w:sz w:val="19"/>
-        </w:rPr>
-      </w:pPr>
-      <w:r>
-        <w:rPr>
-          <w:rFonts w:ascii="Consolas" w:hAnsi="Consolas"/>
-          <w:sz w:val="19"/>
-        </w:rPr>
-        <w:t>// Owns the agent's persistent memory file: loads it on startup, uses a</w:t>
-      </w:r>
-    </w:p>
-    <w:p>
-      <w:pPr>
-        <w:pStyle w:val="NoSpacing"/>
-        <w:rPr>
-          <w:rFonts w:ascii="Consolas" w:hAnsi="Consolas"/>
-          <w:sz w:val="19"/>
-        </w:rPr>
-      </w:pPr>
-      <w:r>
-        <w:rPr>
-          <w:rFonts w:ascii="Consolas" w:hAnsi="Consolas"/>
-          <w:sz w:val="19"/>
-        </w:rPr>
-        <w:t>// dedicated extraction prompt to decide whether a user's message contains a</w:t>
-      </w:r>
-    </w:p>
-    <w:p>
-      <w:pPr>
-        <w:pStyle w:val="NoSpacing"/>
-        <w:rPr>
-          <w:rFonts w:ascii="Consolas" w:hAnsi="Consolas"/>
-          <w:sz w:val="19"/>
-        </w:rPr>
-      </w:pPr>
-      <w:r>
-        <w:rPr>
-          <w:rFonts w:ascii="Consolas" w:hAnsi="Consolas"/>
-          <w:sz w:val="19"/>
-        </w:rPr>
-        <w:t>// durable fact worth remembering, and saves it back to disk when it does -</w:t>
-      </w:r>
-    </w:p>
-    <w:p>
-      <w:pPr>
-        <w:pStyle w:val="NoSpacing"/>
-        <w:rPr>
-          <w:rFonts w:ascii="Consolas" w:hAnsi="Consolas"/>
-          <w:sz w:val="19"/>
-        </w:rPr>
-      </w:pPr>
-      <w:r>
-        <w:rPr>
-          <w:rFonts w:ascii="Consolas" w:hAnsi="Consolas"/>
-          <w:sz w:val="19"/>
-        </w:rPr>
-        <w:t>// giving the agent memory that survives past the current process.</w:t>
-      </w:r>
-    </w:p>
-    <w:p>
-      <w:pPr>
-        <w:pStyle w:val="NoSpacing"/>
-        <w:rPr>
-          <w:rFonts w:ascii="Consolas" w:hAnsi="Consolas"/>
-          <w:sz w:val="19"/>
-        </w:rPr>
-      </w:pPr>
-      <w:r>
-        <w:rPr>
-          <w:rFonts w:ascii="Consolas" w:hAnsi="Consolas"/>
-          <w:sz w:val="19"/>
-        </w:rPr>
-        <w:t>using Microsoft.SemanticKernel.ChatCompletion;</w:t>
-      </w:r>
-    </w:p>
-    <w:p>
-      <w:pPr>
-        <w:pStyle w:val="NoSpacing"/>
-        <w:rPr>
-          <w:rFonts w:ascii="Consolas" w:hAnsi="Consolas"/>
-          <w:sz w:val="19"/>
-        </w:rPr>
-      </w:pPr>
-      <w:r>
-        <w:rPr>
-          <w:rFonts w:ascii="Consolas" w:hAnsi="Consolas"/>
-          <w:sz w:val="19"/>
-        </w:rPr>
-        <w:t>using System.Text.Json;</w:t>
-      </w:r>
-    </w:p>
-    <w:p>
-      <w:pPr>
-        <w:pStyle w:val="NoSpacing"/>
-        <w:rPr>
-          <w:rFonts w:ascii="Consolas" w:hAnsi="Consolas"/>
-          <w:sz w:val="19"/>
-        </w:rPr>
-      </w:pPr>
-    </w:p>
-    <w:p>
-      <w:pPr>
-        <w:pStyle w:val="NoSpacing"/>
-        <w:rPr>
-          <w:rFonts w:ascii="Consolas" w:hAnsi="Consolas"/>
-          <w:sz w:val="19"/>
-        </w:rPr>
-      </w:pPr>
-      <w:r>
-        <w:rPr>
-          <w:rFonts w:ascii="Consolas" w:hAnsi="Consolas"/>
-          <w:sz w:val="19"/>
-        </w:rPr>
-        <w:t>namespace LongTermMemory</w:t>
-      </w:r>
-    </w:p>
-    <w:p>
-      <w:pPr>
-        <w:pStyle w:val="NoSpacing"/>
-        <w:rPr>
-          <w:rFonts w:ascii="Consolas" w:hAnsi="Consolas"/>
-          <w:sz w:val="19"/>
-        </w:rPr>
-      </w:pPr>
-      <w:r>
-        <w:rPr>
-          <w:rFonts w:ascii="Consolas" w:hAnsi="Consolas"/>
-          <w:sz w:val="19"/>
-        </w:rPr>
-        <w:t>{</w:t>
-      </w:r>
-    </w:p>
-    <w:p>
-      <w:pPr>
-        <w:pStyle w:val="NoSpacing"/>
-        <w:rPr>
-          <w:rFonts w:ascii="Consolas" w:hAnsi="Consolas"/>
-          <w:sz w:val="19"/>
-        </w:rPr>
-      </w:pPr>
-      <w:r>
-        <w:rPr>
-          <w:rFonts w:ascii="Consolas" w:hAnsi="Consolas"/>
-          <w:sz w:val="19"/>
-        </w:rPr>
-        <w:t xml:space="preserve">    /// &lt;summary&gt;</w:t>
-      </w:r>
-    </w:p>
-    <w:p>
-      <w:pPr>
-        <w:pStyle w:val="NoSpacing"/>
-        <w:rPr>
-          <w:rFonts w:ascii="Consolas" w:hAnsi="Consolas"/>
-          <w:sz w:val="19"/>
-        </w:rPr>
-      </w:pPr>
-      <w:r>
-        <w:rPr>
-          <w:rFonts w:ascii="Consolas" w:hAnsi="Consolas"/>
-          <w:sz w:val="19"/>
-        </w:rPr>
-        <w:t xml:space="preserve">    /// Handles loading, saving, and extracting permanent facts from the conversation</w:t>
-      </w:r>
-    </w:p>
-    <w:p>
-      <w:pPr>
-        <w:pStyle w:val="NoSpacing"/>
-        <w:rPr>
-          <w:rFonts w:ascii="Consolas" w:hAnsi="Consolas"/>
-          <w:sz w:val="19"/>
-        </w:rPr>
-      </w:pPr>
-      <w:r>
-        <w:rPr>
-          <w:rFonts w:ascii="Consolas" w:hAnsi="Consolas"/>
-          <w:sz w:val="19"/>
-        </w:rPr>
-        <w:t xml:space="preserve">    /// &lt;/summary&gt;</w:t>
-      </w:r>
-    </w:p>
-    <w:p>
-      <w:pPr>
-        <w:pStyle w:val="NoSpacing"/>
-        <w:rPr>
-          <w:rFonts w:ascii="Consolas" w:hAnsi="Consolas"/>
-          <w:sz w:val="19"/>
-        </w:rPr>
-      </w:pPr>
-      <w:r>
-        <w:rPr>
-          <w:rFonts w:ascii="Consolas" w:hAnsi="Consolas"/>
-          <w:sz w:val="19"/>
-        </w:rPr>
-        <w:t xml:space="preserve">    internal class MemoryManager</w:t>
-      </w:r>
-    </w:p>
-    <w:p>
-      <w:pPr>
-        <w:pStyle w:val="NoSpacing"/>
-        <w:rPr>
-          <w:rFonts w:ascii="Consolas" w:hAnsi="Consolas"/>
-          <w:sz w:val="19"/>
-        </w:rPr>
-      </w:pPr>
-      <w:r>
-        <w:rPr>
-          <w:rFonts w:ascii="Consolas" w:hAnsi="Consolas"/>
-          <w:sz w:val="19"/>
-        </w:rPr>
-        <w:t xml:space="preserve">    {</w:t>
-      </w:r>
-    </w:p>
-    <w:p>
-      <w:pPr>
-        <w:pStyle w:val="NoSpacing"/>
-        <w:rPr>
-          <w:rFonts w:ascii="Consolas" w:hAnsi="Consolas"/>
-          <w:sz w:val="19"/>
-        </w:rPr>
-      </w:pPr>
-      <w:r>
-        <w:rPr>
-          <w:rFonts w:ascii="Consolas" w:hAnsi="Consolas"/>
-          <w:sz w:val="19"/>
-        </w:rPr>
-        <w:t xml:space="preserve">        private readonly string _filePath;</w:t>
-      </w:r>
-    </w:p>
-    <w:p>
-      <w:pPr>
-        <w:pStyle w:val="NoSpacing"/>
-        <w:rPr>
-          <w:rFonts w:ascii="Consolas" w:hAnsi="Consolas"/>
-          <w:sz w:val="19"/>
-        </w:rPr>
-      </w:pPr>
-      <w:r>
-        <w:rPr>
-          <w:rFonts w:ascii="Consolas" w:hAnsi="Consolas"/>
-          <w:sz w:val="19"/>
-        </w:rPr>
         <w:t xml:space="preserve">        private readonly IChatCompletionService _chatService;</w:t>
       </w:r>
     </w:p>
@@ -1735,1035 +2919,6 @@
           <w:sz w:val="19"/>
         </w:rPr>
       </w:pPr>
-    </w:p>
-    <w:p>
-      <w:pPr>
-        <w:pStyle w:val="NoSpacing"/>
-        <w:rPr>
-          <w:rFonts w:ascii="Consolas" w:hAnsi="Consolas"/>
-          <w:sz w:val="19"/>
-        </w:rPr>
-      </w:pPr>
-      <w:r>
-        <w:rPr>
-          <w:rFonts w:ascii="Consolas" w:hAnsi="Consolas"/>
-          <w:sz w:val="19"/>
-        </w:rPr>
-        <w:t xml:space="preserve">        public UserMemory CurrentMemory { get; private set;  }</w:t>
-      </w:r>
-    </w:p>
-    <w:p>
-      <w:pPr>
-        <w:pStyle w:val="NoSpacing"/>
-        <w:rPr>
-          <w:rFonts w:ascii="Consolas" w:hAnsi="Consolas"/>
-          <w:sz w:val="19"/>
-        </w:rPr>
-      </w:pPr>
-    </w:p>
-    <w:p>
-      <w:pPr>
-        <w:pStyle w:val="NoSpacing"/>
-        <w:rPr>
-          <w:rFonts w:ascii="Consolas" w:hAnsi="Consolas"/>
-          <w:sz w:val="19"/>
-        </w:rPr>
-      </w:pPr>
-      <w:r>
-        <w:rPr>
-          <w:rFonts w:ascii="Consolas" w:hAnsi="Consolas"/>
-          <w:sz w:val="19"/>
-        </w:rPr>
-        <w:t xml:space="preserve">        public MemoryManager(IChatCompletionService chatService, string filePath = "user_memory.json")</w:t>
-      </w:r>
-    </w:p>
-    <w:p>
-      <w:pPr>
-        <w:pStyle w:val="NoSpacing"/>
-        <w:rPr>
-          <w:rFonts w:ascii="Consolas" w:hAnsi="Consolas"/>
-          <w:sz w:val="19"/>
-        </w:rPr>
-      </w:pPr>
-      <w:r>
-        <w:rPr>
-          <w:rFonts w:ascii="Consolas" w:hAnsi="Consolas"/>
-          <w:sz w:val="19"/>
-        </w:rPr>
-        <w:t xml:space="preserve">        {</w:t>
-      </w:r>
-    </w:p>
-    <w:p>
-      <w:pPr>
-        <w:pStyle w:val="NoSpacing"/>
-        <w:rPr>
-          <w:rFonts w:ascii="Consolas" w:hAnsi="Consolas"/>
-          <w:sz w:val="19"/>
-        </w:rPr>
-      </w:pPr>
-      <w:r>
-        <w:rPr>
-          <w:rFonts w:ascii="Consolas" w:hAnsi="Consolas"/>
-          <w:sz w:val="19"/>
-        </w:rPr>
-        <w:t xml:space="preserve">            _chatService = chatService;</w:t>
-      </w:r>
-    </w:p>
-    <w:p>
-      <w:pPr>
-        <w:pStyle w:val="NoSpacing"/>
-        <w:rPr>
-          <w:rFonts w:ascii="Consolas" w:hAnsi="Consolas"/>
-          <w:sz w:val="19"/>
-        </w:rPr>
-      </w:pPr>
-      <w:r>
-        <w:rPr>
-          <w:rFonts w:ascii="Consolas" w:hAnsi="Consolas"/>
-          <w:sz w:val="19"/>
-        </w:rPr>
-        <w:t xml:space="preserve">            _filePath = filePath;</w:t>
-      </w:r>
-    </w:p>
-    <w:p>
-      <w:pPr>
-        <w:pStyle w:val="NoSpacing"/>
-        <w:rPr>
-          <w:rFonts w:ascii="Consolas" w:hAnsi="Consolas"/>
-          <w:sz w:val="19"/>
-        </w:rPr>
-      </w:pPr>
-      <w:r>
-        <w:rPr>
-          <w:rFonts w:ascii="Consolas" w:hAnsi="Consolas"/>
-          <w:sz w:val="19"/>
-        </w:rPr>
-        <w:t xml:space="preserve">            CurrentMemory = LoadMemory();</w:t>
-      </w:r>
-    </w:p>
-    <w:p>
-      <w:pPr>
-        <w:pStyle w:val="NoSpacing"/>
-        <w:rPr>
-          <w:rFonts w:ascii="Consolas" w:hAnsi="Consolas"/>
-          <w:sz w:val="19"/>
-        </w:rPr>
-      </w:pPr>
-      <w:r>
-        <w:rPr>
-          <w:rFonts w:ascii="Consolas" w:hAnsi="Consolas"/>
-          <w:sz w:val="19"/>
-        </w:rPr>
-        <w:t xml:space="preserve">        }</w:t>
-      </w:r>
-    </w:p>
-    <w:p>
-      <w:pPr>
-        <w:pStyle w:val="NoSpacing"/>
-        <w:rPr>
-          <w:rFonts w:ascii="Consolas" w:hAnsi="Consolas"/>
-          <w:sz w:val="19"/>
-        </w:rPr>
-      </w:pPr>
-    </w:p>
-    <w:p>
-      <w:pPr>
-        <w:pStyle w:val="NoSpacing"/>
-        <w:rPr>
-          <w:rFonts w:ascii="Consolas" w:hAnsi="Consolas"/>
-          <w:sz w:val="19"/>
-        </w:rPr>
-      </w:pPr>
-      <w:r>
-        <w:rPr>
-          <w:rFonts w:ascii="Consolas" w:hAnsi="Consolas"/>
-          <w:sz w:val="19"/>
-        </w:rPr>
-        <w:t xml:space="preserve">        // Reads the memory file from disk if it exists; otherwise starts fresh</w:t>
-      </w:r>
-    </w:p>
-    <w:p>
-      <w:pPr>
-        <w:pStyle w:val="NoSpacing"/>
-        <w:rPr>
-          <w:rFonts w:ascii="Consolas" w:hAnsi="Consolas"/>
-          <w:sz w:val="19"/>
-        </w:rPr>
-      </w:pPr>
-      <w:r>
-        <w:rPr>
-          <w:rFonts w:ascii="Consolas" w:hAnsi="Consolas"/>
-          <w:sz w:val="19"/>
-        </w:rPr>
-        <w:t xml:space="preserve">        // with an empty fact list rather than failing on first run.</w:t>
-      </w:r>
-    </w:p>
-    <w:p>
-      <w:pPr>
-        <w:pStyle w:val="NoSpacing"/>
-        <w:rPr>
-          <w:rFonts w:ascii="Consolas" w:hAnsi="Consolas"/>
-          <w:sz w:val="19"/>
-        </w:rPr>
-      </w:pPr>
-      <w:r>
-        <w:rPr>
-          <w:rFonts w:ascii="Consolas" w:hAnsi="Consolas"/>
-          <w:sz w:val="19"/>
-        </w:rPr>
-        <w:t xml:space="preserve">        private UserMemory LoadMemory()</w:t>
-      </w:r>
-    </w:p>
-    <w:p>
-      <w:pPr>
-        <w:pStyle w:val="NoSpacing"/>
-        <w:rPr>
-          <w:rFonts w:ascii="Consolas" w:hAnsi="Consolas"/>
-          <w:sz w:val="19"/>
-        </w:rPr>
-      </w:pPr>
-      <w:r>
-        <w:rPr>
-          <w:rFonts w:ascii="Consolas" w:hAnsi="Consolas"/>
-          <w:sz w:val="19"/>
-        </w:rPr>
-        <w:t xml:space="preserve">        {</w:t>
-      </w:r>
-    </w:p>
-    <w:p>
-      <w:pPr>
-        <w:pStyle w:val="NoSpacing"/>
-        <w:rPr>
-          <w:rFonts w:ascii="Consolas" w:hAnsi="Consolas"/>
-          <w:sz w:val="19"/>
-        </w:rPr>
-      </w:pPr>
-      <w:r>
-        <w:rPr>
-          <w:rFonts w:ascii="Consolas" w:hAnsi="Consolas"/>
-          <w:sz w:val="19"/>
-        </w:rPr>
-        <w:t xml:space="preserve">            if (File.Exists(_filePath))</w:t>
-      </w:r>
-    </w:p>
-    <w:p>
-      <w:pPr>
-        <w:pStyle w:val="NoSpacing"/>
-        <w:rPr>
-          <w:rFonts w:ascii="Consolas" w:hAnsi="Consolas"/>
-          <w:sz w:val="19"/>
-        </w:rPr>
-      </w:pPr>
-      <w:r>
-        <w:rPr>
-          <w:rFonts w:ascii="Consolas" w:hAnsi="Consolas"/>
-          <w:sz w:val="19"/>
-        </w:rPr>
-        <w:t xml:space="preserve">            {</w:t>
-      </w:r>
-    </w:p>
-    <w:p>
-      <w:pPr>
-        <w:pStyle w:val="NoSpacing"/>
-        <w:rPr>
-          <w:rFonts w:ascii="Consolas" w:hAnsi="Consolas"/>
-          <w:sz w:val="19"/>
-        </w:rPr>
-      </w:pPr>
-      <w:r>
-        <w:rPr>
-          <w:rFonts w:ascii="Consolas" w:hAnsi="Consolas"/>
-          <w:sz w:val="19"/>
-        </w:rPr>
-        <w:t xml:space="preserve">                string json = File.ReadAllText(_filePath);</w:t>
-      </w:r>
-    </w:p>
-    <w:p>
-      <w:pPr>
-        <w:pStyle w:val="NoSpacing"/>
-        <w:rPr>
-          <w:rFonts w:ascii="Consolas" w:hAnsi="Consolas"/>
-          <w:sz w:val="19"/>
-        </w:rPr>
-      </w:pPr>
-      <w:r>
-        <w:rPr>
-          <w:rFonts w:ascii="Consolas" w:hAnsi="Consolas"/>
-          <w:sz w:val="19"/>
-        </w:rPr>
-        <w:t xml:space="preserve">                return JsonSerializer.Deserialize&lt;UserMemory&gt;(json);</w:t>
-      </w:r>
-    </w:p>
-    <w:p>
-      <w:pPr>
-        <w:pStyle w:val="NoSpacing"/>
-        <w:rPr>
-          <w:rFonts w:ascii="Consolas" w:hAnsi="Consolas"/>
-          <w:sz w:val="19"/>
-        </w:rPr>
-      </w:pPr>
-      <w:r>
-        <w:rPr>
-          <w:rFonts w:ascii="Consolas" w:hAnsi="Consolas"/>
-          <w:sz w:val="19"/>
-        </w:rPr>
-        <w:t xml:space="preserve">            }</w:t>
-      </w:r>
-    </w:p>
-    <w:p>
-      <w:pPr>
-        <w:pStyle w:val="NoSpacing"/>
-        <w:rPr>
-          <w:rFonts w:ascii="Consolas" w:hAnsi="Consolas"/>
-          <w:sz w:val="19"/>
-        </w:rPr>
-      </w:pPr>
-      <w:r>
-        <w:rPr>
-          <w:rFonts w:ascii="Consolas" w:hAnsi="Consolas"/>
-          <w:sz w:val="19"/>
-        </w:rPr>
-        <w:t xml:space="preserve">            return new UserMemory();</w:t>
-      </w:r>
-    </w:p>
-    <w:p>
-      <w:pPr>
-        <w:pStyle w:val="NoSpacing"/>
-        <w:rPr>
-          <w:rFonts w:ascii="Consolas" w:hAnsi="Consolas"/>
-          <w:sz w:val="19"/>
-        </w:rPr>
-      </w:pPr>
-      <w:r>
-        <w:rPr>
-          <w:rFonts w:ascii="Consolas" w:hAnsi="Consolas"/>
-          <w:sz w:val="19"/>
-        </w:rPr>
-        <w:t xml:space="preserve">        }</w:t>
-      </w:r>
-    </w:p>
-    <w:p>
-      <w:pPr>
-        <w:pStyle w:val="NoSpacing"/>
-        <w:rPr>
-          <w:rFonts w:ascii="Consolas" w:hAnsi="Consolas"/>
-          <w:sz w:val="19"/>
-        </w:rPr>
-      </w:pPr>
-    </w:p>
-    <w:p>
-      <w:pPr>
-        <w:pStyle w:val="NoSpacing"/>
-        <w:rPr>
-          <w:rFonts w:ascii="Consolas" w:hAnsi="Consolas"/>
-          <w:sz w:val="19"/>
-        </w:rPr>
-      </w:pPr>
-      <w:r>
-        <w:rPr>
-          <w:rFonts w:ascii="Consolas" w:hAnsi="Consolas"/>
-          <w:sz w:val="19"/>
-        </w:rPr>
-        <w:t xml:space="preserve">        /// &lt;summary&gt;</w:t>
-      </w:r>
-    </w:p>
-    <w:p>
-      <w:pPr>
-        <w:pStyle w:val="NoSpacing"/>
-        <w:rPr>
-          <w:rFonts w:ascii="Consolas" w:hAnsi="Consolas"/>
-          <w:sz w:val="19"/>
-        </w:rPr>
-      </w:pPr>
-      <w:r>
-        <w:rPr>
-          <w:rFonts w:ascii="Consolas" w:hAnsi="Consolas"/>
-          <w:sz w:val="19"/>
-        </w:rPr>
-        <w:t xml:space="preserve">        /// Analyzes the user input in the background to determin if a new fact should be saved</w:t>
-      </w:r>
-    </w:p>
-    <w:p>
-      <w:pPr>
-        <w:pStyle w:val="NoSpacing"/>
-        <w:rPr>
-          <w:rFonts w:ascii="Consolas" w:hAnsi="Consolas"/>
-          <w:sz w:val="19"/>
-        </w:rPr>
-      </w:pPr>
-      <w:r>
-        <w:rPr>
-          <w:rFonts w:ascii="Consolas" w:hAnsi="Consolas"/>
-          <w:sz w:val="19"/>
-        </w:rPr>
-        <w:t xml:space="preserve">        /// &lt;/summary&gt;</w:t>
-      </w:r>
-    </w:p>
-    <w:p>
-      <w:pPr>
-        <w:pStyle w:val="NoSpacing"/>
-        <w:rPr>
-          <w:rFonts w:ascii="Consolas" w:hAnsi="Consolas"/>
-          <w:sz w:val="19"/>
-        </w:rPr>
-      </w:pPr>
-      <w:r>
-        <w:rPr>
-          <w:rFonts w:ascii="Consolas" w:hAnsi="Consolas"/>
-          <w:sz w:val="19"/>
-        </w:rPr>
-        <w:t xml:space="preserve">        public async Task ExtractAndSaveFactAsync(string userInput)</w:t>
-      </w:r>
-    </w:p>
-    <w:p>
-      <w:pPr>
-        <w:pStyle w:val="NoSpacing"/>
-        <w:rPr>
-          <w:rFonts w:ascii="Consolas" w:hAnsi="Consolas"/>
-          <w:sz w:val="19"/>
-        </w:rPr>
-      </w:pPr>
-      <w:r>
-        <w:rPr>
-          <w:rFonts w:ascii="Consolas" w:hAnsi="Consolas"/>
-          <w:sz w:val="19"/>
-        </w:rPr>
-        <w:t xml:space="preserve">        {</w:t>
-      </w:r>
-    </w:p>
-    <w:p>
-      <w:pPr>
-        <w:pStyle w:val="NoSpacing"/>
-        <w:rPr>
-          <w:rFonts w:ascii="Consolas" w:hAnsi="Consolas"/>
-          <w:sz w:val="19"/>
-        </w:rPr>
-      </w:pPr>
-      <w:r>
-        <w:rPr>
-          <w:rFonts w:ascii="Consolas" w:hAnsi="Consolas"/>
-          <w:sz w:val="19"/>
-        </w:rPr>
-        <w:t xml:space="preserve">            // Prompt engineered specifcally for data extraction, ignoring conversational filler.</w:t>
-      </w:r>
-    </w:p>
-    <w:p>
-      <w:pPr>
-        <w:pStyle w:val="NoSpacing"/>
-        <w:rPr>
-          <w:rFonts w:ascii="Consolas" w:hAnsi="Consolas"/>
-          <w:sz w:val="19"/>
-        </w:rPr>
-      </w:pPr>
-      <w:r>
-        <w:rPr>
-          <w:rFonts w:ascii="Consolas" w:hAnsi="Consolas"/>
-          <w:sz w:val="19"/>
-        </w:rPr>
-        <w:t xml:space="preserve">            // The extraction rules are the system message; the actual text to analyze must be</w:t>
-      </w:r>
-    </w:p>
-    <w:p>
-      <w:pPr>
-        <w:pStyle w:val="NoSpacing"/>
-        <w:rPr>
-          <w:rFonts w:ascii="Consolas" w:hAnsi="Consolas"/>
-          <w:sz w:val="19"/>
-        </w:rPr>
-      </w:pPr>
-      <w:r>
-        <w:rPr>
-          <w:rFonts w:ascii="Consolas" w:hAnsi="Consolas"/>
-          <w:sz w:val="19"/>
-        </w:rPr>
-        <w:t xml:space="preserve">            // a separate user message - a ChatHistory containing only a system message is</w:t>
-      </w:r>
-    </w:p>
-    <w:p>
-      <w:pPr>
-        <w:pStyle w:val="NoSpacing"/>
-        <w:rPr>
-          <w:rFonts w:ascii="Consolas" w:hAnsi="Consolas"/>
-          <w:sz w:val="19"/>
-        </w:rPr>
-      </w:pPr>
-      <w:r>
-        <w:rPr>
-          <w:rFonts w:ascii="Consolas" w:hAnsi="Consolas"/>
-          <w:sz w:val="19"/>
-        </w:rPr>
-        <w:t xml:space="preserve">            // rejected by Gemini ("Chat history can't contain only system messages").</w:t>
-      </w:r>
-    </w:p>
-    <w:p>
-      <w:pPr>
-        <w:pStyle w:val="NoSpacing"/>
-        <w:rPr>
-          <w:rFonts w:ascii="Consolas" w:hAnsi="Consolas"/>
-          <w:sz w:val="19"/>
-        </w:rPr>
-      </w:pPr>
-      <w:r>
-        <w:rPr>
-          <w:rFonts w:ascii="Consolas" w:hAnsi="Consolas"/>
-          <w:sz w:val="19"/>
-        </w:rPr>
-        <w:t xml:space="preserve">            string systemPrompt = @"</w:t>
-      </w:r>
-    </w:p>
-    <w:p>
-      <w:pPr>
-        <w:pStyle w:val="NoSpacing"/>
-        <w:rPr>
-          <w:rFonts w:ascii="Consolas" w:hAnsi="Consolas"/>
-          <w:sz w:val="19"/>
-        </w:rPr>
-      </w:pPr>
-      <w:r>
-        <w:rPr>
-          <w:rFonts w:ascii="Consolas" w:hAnsi="Consolas"/>
-          <w:sz w:val="19"/>
-        </w:rPr>
-        <w:t xml:space="preserve">                Analyze the user's input.  If they state a permanent fact about themselves</w:t>
-      </w:r>
-    </w:p>
-    <w:p>
-      <w:pPr>
-        <w:pStyle w:val="NoSpacing"/>
-        <w:rPr>
-          <w:rFonts w:ascii="Consolas" w:hAnsi="Consolas"/>
-          <w:sz w:val="19"/>
-        </w:rPr>
-      </w:pPr>
-      <w:r>
-        <w:rPr>
-          <w:rFonts w:ascii="Consolas" w:hAnsi="Consolas"/>
-          <w:sz w:val="19"/>
-        </w:rPr>
-        <w:t xml:space="preserve">                (e.g. their name, preferences, job, family), extract it as a short sentence.</w:t>
-      </w:r>
-    </w:p>
-    <w:p>
-      <w:pPr>
-        <w:pStyle w:val="NoSpacing"/>
-        <w:rPr>
-          <w:rFonts w:ascii="Consolas" w:hAnsi="Consolas"/>
-          <w:sz w:val="19"/>
-        </w:rPr>
-      </w:pPr>
-      <w:r>
-        <w:rPr>
-          <w:rFonts w:ascii="Consolas" w:hAnsi="Consolas"/>
-          <w:sz w:val="19"/>
-        </w:rPr>
-        <w:t xml:space="preserve">                If there are no new personal facts, output exactly 'NONE'.</w:t>
-      </w:r>
-    </w:p>
-    <w:p>
-      <w:pPr>
-        <w:pStyle w:val="NoSpacing"/>
-        <w:rPr>
-          <w:rFonts w:ascii="Consolas" w:hAnsi="Consolas"/>
-          <w:sz w:val="19"/>
-        </w:rPr>
-      </w:pPr>
-      <w:r>
-        <w:rPr>
-          <w:rFonts w:ascii="Consolas" w:hAnsi="Consolas"/>
-          <w:sz w:val="19"/>
-        </w:rPr>
-        <w:t xml:space="preserve">            ";</w:t>
-      </w:r>
-    </w:p>
-    <w:p>
-      <w:pPr>
-        <w:pStyle w:val="NoSpacing"/>
-        <w:rPr>
-          <w:rFonts w:ascii="Consolas" w:hAnsi="Consolas"/>
-          <w:sz w:val="19"/>
-        </w:rPr>
-      </w:pPr>
-    </w:p>
-    <w:p>
-      <w:pPr>
-        <w:pStyle w:val="NoSpacing"/>
-        <w:rPr>
-          <w:rFonts w:ascii="Consolas" w:hAnsi="Consolas"/>
-          <w:sz w:val="19"/>
-        </w:rPr>
-      </w:pPr>
-      <w:r>
-        <w:rPr>
-          <w:rFonts w:ascii="Consolas" w:hAnsi="Consolas"/>
-          <w:sz w:val="19"/>
-        </w:rPr>
-        <w:t xml:space="preserve">            var history = new ChatHistory(systemPrompt);</w:t>
-      </w:r>
-    </w:p>
-    <w:p>
-      <w:pPr>
-        <w:pStyle w:val="NoSpacing"/>
-        <w:rPr>
-          <w:rFonts w:ascii="Consolas" w:hAnsi="Consolas"/>
-          <w:sz w:val="19"/>
-        </w:rPr>
-      </w:pPr>
-      <w:r>
-        <w:rPr>
-          <w:rFonts w:ascii="Consolas" w:hAnsi="Consolas"/>
-          <w:sz w:val="19"/>
-        </w:rPr>
-        <w:t xml:space="preserve">            history.AddUserMessage(userInput);</w:t>
-      </w:r>
-    </w:p>
-    <w:p>
-      <w:pPr>
-        <w:pStyle w:val="NoSpacing"/>
-        <w:rPr>
-          <w:rFonts w:ascii="Consolas" w:hAnsi="Consolas"/>
-          <w:sz w:val="19"/>
-        </w:rPr>
-      </w:pPr>
-      <w:r>
-        <w:rPr>
-          <w:rFonts w:ascii="Consolas" w:hAnsi="Consolas"/>
-          <w:sz w:val="19"/>
-        </w:rPr>
-        <w:t xml:space="preserve">            var response = await _chatService.GetChatMessageContentAsync(history);</w:t>
-      </w:r>
-    </w:p>
-    <w:p>
-      <w:pPr>
-        <w:pStyle w:val="NoSpacing"/>
-        <w:rPr>
-          <w:rFonts w:ascii="Consolas" w:hAnsi="Consolas"/>
-          <w:sz w:val="19"/>
-        </w:rPr>
-      </w:pPr>
-      <w:r>
-        <w:rPr>
-          <w:rFonts w:ascii="Consolas" w:hAnsi="Consolas"/>
-          <w:sz w:val="19"/>
-        </w:rPr>
-        <w:t xml:space="preserve">            string fact = response.Content?.Trim() ?? "NONE";</w:t>
-      </w:r>
-    </w:p>
-    <w:p>
-      <w:pPr>
-        <w:pStyle w:val="NoSpacing"/>
-        <w:rPr>
-          <w:rFonts w:ascii="Consolas" w:hAnsi="Consolas"/>
-          <w:sz w:val="19"/>
-        </w:rPr>
-      </w:pPr>
-    </w:p>
-    <w:p>
-      <w:pPr>
-        <w:pStyle w:val="NoSpacing"/>
-        <w:rPr>
-          <w:rFonts w:ascii="Consolas" w:hAnsi="Consolas"/>
-          <w:sz w:val="19"/>
-        </w:rPr>
-      </w:pPr>
-      <w:r>
-        <w:rPr>
-          <w:rFonts w:ascii="Consolas" w:hAnsi="Consolas"/>
-          <w:sz w:val="19"/>
-        </w:rPr>
-        <w:t xml:space="preserve">            // Only update the file if a valid fact was found</w:t>
-      </w:r>
-    </w:p>
-    <w:p>
-      <w:pPr>
-        <w:pStyle w:val="NoSpacing"/>
-        <w:rPr>
-          <w:rFonts w:ascii="Consolas" w:hAnsi="Consolas"/>
-          <w:sz w:val="19"/>
-        </w:rPr>
-      </w:pPr>
-      <w:r>
-        <w:rPr>
-          <w:rFonts w:ascii="Consolas" w:hAnsi="Consolas"/>
-          <w:sz w:val="19"/>
-        </w:rPr>
-        <w:t xml:space="preserve">            if (!fact.Equals("NONE", StringComparison.OrdinalIgnoreCase))</w:t>
-      </w:r>
-    </w:p>
-    <w:p>
-      <w:pPr>
-        <w:pStyle w:val="NoSpacing"/>
-        <w:rPr>
-          <w:rFonts w:ascii="Consolas" w:hAnsi="Consolas"/>
-          <w:sz w:val="19"/>
-        </w:rPr>
-      </w:pPr>
-      <w:r>
-        <w:rPr>
-          <w:rFonts w:ascii="Consolas" w:hAnsi="Consolas"/>
-          <w:sz w:val="19"/>
-        </w:rPr>
-        <w:t xml:space="preserve">            {</w:t>
-      </w:r>
-    </w:p>
-    <w:p>
-      <w:pPr>
-        <w:pStyle w:val="NoSpacing"/>
-        <w:rPr>
-          <w:rFonts w:ascii="Consolas" w:hAnsi="Consolas"/>
-          <w:sz w:val="19"/>
-        </w:rPr>
-      </w:pPr>
-      <w:r>
-        <w:rPr>
-          <w:rFonts w:ascii="Consolas" w:hAnsi="Consolas"/>
-          <w:sz w:val="19"/>
-        </w:rPr>
-        <w:t xml:space="preserve">                CurrentMemory.Facts.Add(fact);</w:t>
-      </w:r>
-    </w:p>
-    <w:p>
-      <w:pPr>
-        <w:pStyle w:val="NoSpacing"/>
-        <w:rPr>
-          <w:rFonts w:ascii="Consolas" w:hAnsi="Consolas"/>
-          <w:sz w:val="19"/>
-        </w:rPr>
-      </w:pPr>
-      <w:r>
-        <w:rPr>
-          <w:rFonts w:ascii="Consolas" w:hAnsi="Consolas"/>
-          <w:sz w:val="19"/>
-        </w:rPr>
-        <w:t xml:space="preserve">                SaveMemory();</w:t>
-      </w:r>
-    </w:p>
-    <w:p>
-      <w:pPr>
-        <w:pStyle w:val="NoSpacing"/>
-        <w:rPr>
-          <w:rFonts w:ascii="Consolas" w:hAnsi="Consolas"/>
-          <w:sz w:val="19"/>
-        </w:rPr>
-      </w:pPr>
-      <w:r>
-        <w:rPr>
-          <w:rFonts w:ascii="Consolas" w:hAnsi="Consolas"/>
-          <w:sz w:val="19"/>
-        </w:rPr>
-        <w:t xml:space="preserve">                Console.WriteLine($"\n   [MEMORY MANAGER] New fact saved: {fact}");</w:t>
-      </w:r>
-    </w:p>
-    <w:p>
-      <w:pPr>
-        <w:pStyle w:val="NoSpacing"/>
-        <w:rPr>
-          <w:rFonts w:ascii="Consolas" w:hAnsi="Consolas"/>
-          <w:sz w:val="19"/>
-        </w:rPr>
-      </w:pPr>
-      <w:r>
-        <w:rPr>
-          <w:rFonts w:ascii="Consolas" w:hAnsi="Consolas"/>
-          <w:sz w:val="19"/>
-        </w:rPr>
-        <w:t xml:space="preserve">            }</w:t>
-      </w:r>
-    </w:p>
-    <w:p>
-      <w:pPr>
-        <w:pStyle w:val="NoSpacing"/>
-        <w:rPr>
-          <w:rFonts w:ascii="Consolas" w:hAnsi="Consolas"/>
-          <w:sz w:val="19"/>
-        </w:rPr>
-      </w:pPr>
-      <w:r>
-        <w:rPr>
-          <w:rFonts w:ascii="Consolas" w:hAnsi="Consolas"/>
-          <w:sz w:val="19"/>
-        </w:rPr>
-        <w:t xml:space="preserve">        }</w:t>
-      </w:r>
-    </w:p>
-    <w:p>
-      <w:pPr>
-        <w:pStyle w:val="NoSpacing"/>
-        <w:rPr>
-          <w:rFonts w:ascii="Consolas" w:hAnsi="Consolas"/>
-          <w:sz w:val="19"/>
-        </w:rPr>
-      </w:pPr>
-    </w:p>
-    <w:p>
-      <w:pPr>
-        <w:pStyle w:val="NoSpacing"/>
-        <w:rPr>
-          <w:rFonts w:ascii="Consolas" w:hAnsi="Consolas"/>
-          <w:sz w:val="19"/>
-        </w:rPr>
-      </w:pPr>
-      <w:r>
-        <w:rPr>
-          <w:rFonts w:ascii="Consolas" w:hAnsi="Consolas"/>
-          <w:sz w:val="19"/>
-        </w:rPr>
-        <w:t xml:space="preserve">        // Persists the current in-memory fact list back to the JSON file,</w:t>
-      </w:r>
-    </w:p>
-    <w:p>
-      <w:pPr>
-        <w:pStyle w:val="NoSpacing"/>
-        <w:rPr>
-          <w:rFonts w:ascii="Consolas" w:hAnsi="Consolas"/>
-          <w:sz w:val="19"/>
-        </w:rPr>
-      </w:pPr>
-      <w:r>
-        <w:rPr>
-          <w:rFonts w:ascii="Consolas" w:hAnsi="Consolas"/>
-          <w:sz w:val="19"/>
-        </w:rPr>
-        <w:t xml:space="preserve">        // overwriting it entirely each time.</w:t>
-      </w:r>
-    </w:p>
-    <w:p>
-      <w:pPr>
-        <w:pStyle w:val="NoSpacing"/>
-        <w:rPr>
-          <w:rFonts w:ascii="Consolas" w:hAnsi="Consolas"/>
-          <w:sz w:val="19"/>
-        </w:rPr>
-      </w:pPr>
-      <w:r>
-        <w:rPr>
-          <w:rFonts w:ascii="Consolas" w:hAnsi="Consolas"/>
-          <w:sz w:val="19"/>
-        </w:rPr>
-        <w:t xml:space="preserve">        private void SaveMemory()</w:t>
-      </w:r>
-    </w:p>
-    <w:p>
-      <w:pPr>
-        <w:pStyle w:val="NoSpacing"/>
-        <w:rPr>
-          <w:rFonts w:ascii="Consolas" w:hAnsi="Consolas"/>
-          <w:sz w:val="19"/>
-        </w:rPr>
-      </w:pPr>
-      <w:r>
-        <w:rPr>
-          <w:rFonts w:ascii="Consolas" w:hAnsi="Consolas"/>
-          <w:sz w:val="19"/>
-        </w:rPr>
-        <w:t xml:space="preserve">        {</w:t>
-      </w:r>
-    </w:p>
-    <w:p>
-      <w:pPr>
-        <w:pStyle w:val="NoSpacing"/>
-        <w:rPr>
-          <w:rFonts w:ascii="Consolas" w:hAnsi="Consolas"/>
-          <w:sz w:val="19"/>
-        </w:rPr>
-      </w:pPr>
-      <w:r>
-        <w:rPr>
-          <w:rFonts w:ascii="Consolas" w:hAnsi="Consolas"/>
-          <w:sz w:val="19"/>
-        </w:rPr>
-        <w:t xml:space="preserve">            string json = JsonSerializer.Serialize(CurrentMemory, new JsonSerializerOptions { WriteIndented = true });</w:t>
-      </w:r>
-    </w:p>
-    <w:p>
-      <w:pPr>
-        <w:pStyle w:val="NoSpacing"/>
-        <w:rPr>
-          <w:rFonts w:ascii="Consolas" w:hAnsi="Consolas"/>
-          <w:sz w:val="19"/>
-        </w:rPr>
-      </w:pPr>
-      <w:r>
-        <w:rPr>
-          <w:rFonts w:ascii="Consolas" w:hAnsi="Consolas"/>
-          <w:sz w:val="19"/>
-        </w:rPr>
-        <w:t xml:space="preserve">            File.WriteAllText(_filePath, json);</w:t>
-      </w:r>
-    </w:p>
-    <w:p>
-      <w:pPr>
-        <w:pStyle w:val="NoSpacing"/>
-        <w:rPr>
-          <w:rFonts w:ascii="Consolas" w:hAnsi="Consolas"/>
-          <w:sz w:val="19"/>
-        </w:rPr>
-      </w:pPr>
-      <w:r>
-        <w:rPr>
-          <w:rFonts w:ascii="Consolas" w:hAnsi="Consolas"/>
-          <w:sz w:val="19"/>
-        </w:rPr>
-        <w:t xml:space="preserve">        }</w:t>
-      </w:r>
-    </w:p>
-    <w:p>
-      <w:pPr>
-        <w:pStyle w:val="NoSpacing"/>
-        <w:rPr>
-          <w:rFonts w:ascii="Consolas" w:hAnsi="Consolas"/>
-          <w:sz w:val="19"/>
-        </w:rPr>
-      </w:pPr>
-      <w:r>
-        <w:rPr>
-          <w:rFonts w:ascii="Consolas" w:hAnsi="Consolas"/>
-          <w:sz w:val="19"/>
-        </w:rPr>
-        <w:t xml:space="preserve">    }</w:t>
-      </w:r>
-    </w:p>
-    <w:p>
-      <w:pPr>
-        <w:pStyle w:val="NoSpacing"/>
-        <w:rPr>
-          <w:rFonts w:ascii="Consolas" w:hAnsi="Consolas"/>
-          <w:sz w:val="19"/>
-        </w:rPr>
-      </w:pPr>
-      <w:r>
-        <w:rPr>
-          <w:rFonts w:ascii="Consolas" w:hAnsi="Consolas"/>
-          <w:sz w:val="19"/>
-        </w:rPr>
-        <w:t>}</w:t>
-      </w:r>
-    </w:p>
-    <w:p>
-      <w:pPr>
-        <w:rPr>
-          <w:b/>
-        </w:rPr>
-      </w:pPr>
-      <w:r>
-        <w:rPr>
-          <w:b/>
-        </w:rPr>
-        <w:t>MemoryAgent.cs</w:t>
-      </w:r>
-    </w:p>
-    <w:p>
-      <w:pPr>
-        <w:pStyle w:val="NoSpacing"/>
-        <w:rPr>
-          <w:rFonts w:ascii="Consolas" w:hAnsi="Consolas"/>
-          <w:sz w:val="19"/>
-        </w:rPr>
-      </w:pPr>
-      <w:r>
-        <w:rPr>
-          <w:rFonts w:ascii="Consolas" w:hAnsi="Consolas"/>
-          <w:sz w:val="19"/>
-        </w:rPr>
-        <w:t>using Microsoft.SemanticKernel.ChatCompletion;</w:t>
-      </w:r>
-    </w:p>
-    <w:p>
-      <w:pPr>
-        <w:pStyle w:val="NoSpacing"/>
-        <w:rPr>
-          <w:rFonts w:ascii="Consolas" w:hAnsi="Consolas"/>
-          <w:sz w:val="19"/>
-        </w:rPr>
-      </w:pPr>
-    </w:p>
-    <w:p>
-      <w:pPr>
-        <w:pStyle w:val="NoSpacing"/>
-        <w:rPr>
-          <w:rFonts w:ascii="Consolas" w:hAnsi="Consolas"/>
-          <w:sz w:val="19"/>
-        </w:rPr>
-      </w:pPr>
-      <w:r>
-        <w:rPr>
-          <w:rFonts w:ascii="Consolas" w:hAnsi="Consolas"/>
-          <w:sz w:val="19"/>
-        </w:rPr>
-        <w:t>namespace LongTermMemory</w:t>
-      </w:r>
-    </w:p>
-    <w:p>
-      <w:pPr>
-        <w:pStyle w:val="NoSpacing"/>
-        <w:rPr>
-          <w:rFonts w:ascii="Consolas" w:hAnsi="Consolas"/>
-          <w:sz w:val="19"/>
-        </w:rPr>
-      </w:pPr>
-      <w:r>
-        <w:rPr>
-          <w:rFonts w:ascii="Consolas" w:hAnsi="Consolas"/>
-          <w:sz w:val="19"/>
-        </w:rPr>
-        <w:t>{</w:t>
-      </w:r>
-    </w:p>
-    <w:p>
-      <w:pPr>
-        <w:pStyle w:val="NoSpacing"/>
-        <w:rPr>
-          <w:rFonts w:ascii="Consolas" w:hAnsi="Consolas"/>
-          <w:sz w:val="19"/>
-        </w:rPr>
-      </w:pPr>
-      <w:r>
-        <w:rPr>
-          <w:rFonts w:ascii="Consolas" w:hAnsi="Consolas"/>
-          <w:sz w:val="19"/>
-        </w:rPr>
-        <w:t xml:space="preserve">    internal class MemoryAgent</w:t>
-      </w:r>
-    </w:p>
-    <w:p>
-      <w:pPr>
-        <w:pStyle w:val="NoSpacing"/>
-        <w:rPr>
-          <w:rFonts w:ascii="Consolas" w:hAnsi="Consolas"/>
-          <w:sz w:val="19"/>
-        </w:rPr>
-      </w:pPr>
-      <w:r>
-        <w:rPr>
-          <w:rFonts w:ascii="Consolas" w:hAnsi="Consolas"/>
-          <w:sz w:val="19"/>
-        </w:rPr>
-        <w:t xml:space="preserve">    {</w:t>
-      </w:r>
-    </w:p>
-    <w:p>
-      <w:pPr>
-        <w:pStyle w:val="NoSpacing"/>
-        <w:rPr>
-          <w:rFonts w:ascii="Consolas" w:hAnsi="Consolas"/>
-          <w:sz w:val="19"/>
-        </w:rPr>
-      </w:pPr>
-      <w:r>
-        <w:rPr>
-          <w:rFonts w:ascii="Consolas" w:hAnsi="Consolas"/>
-          <w:sz w:val="19"/>
-        </w:rPr>
-        <w:t xml:space="preserve">        private readonly IChatCompletionService _chatService;</w:t>
-      </w:r>
-    </w:p>
-    <w:p>
-      <w:pPr>
-        <w:pStyle w:val="NoSpacing"/>
-        <w:rPr>
-          <w:rFonts w:ascii="Consolas" w:hAnsi="Consolas"/>
-          <w:sz w:val="19"/>
-        </w:rPr>
-      </w:pPr>
       <w:r>
         <w:rPr>
           <w:rFonts w:ascii="Consolas" w:hAnsi="Consolas"/>
@@ -2794,6 +2949,7 @@
           <w:rFonts w:ascii="Consolas" w:hAnsi="Consolas"/>
           <w:sz w:val="19"/>
         </w:rPr>
+        <w:lastRenderedPageBreak/>
         <w:t xml:space="preserve">        public MemoryAgent(IChatCompletionService chatService)</w:t>
       </w:r>
     </w:p>

</xml_diff>